<commit_message>
Restyle Help FAQ doc: category hierarchy, continuous numbering, hyperlinks
- Rebrand to SC Blue #0061C7, navy #2C3A87 category bars, #D9E7F7
  subcategory boxes with #0061C7 borders
- Replace the banner with a solid blue block carrying a letter-spaced
  green eyebrow and the Heading 1 title, removing the subtitle and the
  duplicate plain-text title below it
- Introduce a true Category level: Card Services groups Activate Card and
  Lost Card; Auto Financing splits into the source page's own two
  sections
- Number Q&A continuously Q1-Q33 across the whole document
- Make source URLs and in-answer URLs real clickable hyperlinks
- Split the online-activation and SC Mobile download points out of the
  activation answers so each Q&A covers one topic

Co-Authored-By: Claude Opus 5 <noreply@anthropic.com>
Claude-Session: https://claude.ai/code/session_01LumFsFKRxh67B7Hnvhc4FT
</commit_message>
<xml_diff>
--- a/SCB_Bank_Help_FAQ.docx
+++ b/SCB_Bank_Help_FAQ.docx
@@ -4,99 +4,126 @@
   <w:body>
     <w:p>
       <w:pPr>
-        <w:shd w:fill="254498" w:color="auto" w:val="clear"/>
-        <w:spacing w:after="0" w:before="0" w:line="360"/>
-        <w:jc w:val="center"/>
+        <w:shd w:fill="0061C7" w:color="auto" w:val="clear"/>
+        <w:spacing w:after="0" w:before="240" w:line="260"/>
+        <w:ind w:left="240" w:right="240"/>
+      </w:pPr>
+      <w:r>
+        <w:rPr>
+          <w:b/>
+          <w:bCs/>
+          <w:smallCaps/>
+          <w:color w:val="92E773"/>
+          <w:spacing w:val="80"/>
+          <w:sz w:val="20"/>
+          <w:szCs w:val="20"/>
+        </w:rPr>
+        <w:t xml:space="preserve">Standard Chartered Singapore</w:t>
+      </w:r>
+    </w:p>
+    <w:p>
+      <w:pPr>
+        <w:pStyle w:val="Heading1"/>
+        <w:shd w:fill="0061C7" w:color="auto" w:val="clear"/>
+        <w:spacing w:after="300" w:before="60" w:line="420"/>
+        <w:ind w:left="240" w:right="240"/>
       </w:pPr>
       <w:r>
         <w:rPr>
           <w:b/>
           <w:bCs/>
           <w:color w:val="FFFFFF"/>
-          <w:sz w:val="34"/>
-          <w:szCs w:val="34"/>
+          <w:sz w:val="40"/>
+          <w:szCs w:val="40"/>
         </w:rPr>
         <w:t xml:space="preserve">Standard Chartered Singapore Help Centre FAQ</w:t>
       </w:r>
     </w:p>
     <w:p>
       <w:pPr>
-        <w:shd w:fill="92E773" w:color="auto" w:val="clear"/>
-        <w:spacing w:after="360" w:before="0" w:line="300"/>
-        <w:jc w:val="center"/>
-      </w:pPr>
-      <w:r>
-        <w:rPr>
-          <w:b/>
-          <w:bCs/>
-          <w:color w:val="254498"/>
+        <w:pStyle w:val="Heading2"/>
+        <w:shd w:fill="2C3A87" w:color="auto" w:val="clear"/>
+        <w:spacing w:after="180" w:before="360" w:line="320"/>
+        <w:ind w:left="160" w:right="160"/>
+      </w:pPr>
+      <w:r>
+        <w:rPr>
+          <w:b/>
+          <w:bCs/>
+          <w:color w:val="FFFFFF"/>
+          <w:sz w:val="28"/>
+          <w:szCs w:val="28"/>
+        </w:rPr>
+        <w:t xml:space="preserve">Card Services</w:t>
+      </w:r>
+    </w:p>
+    <w:p>
+      <w:pPr>
+        <w:pStyle w:val="Heading3"/>
+        <w:pBdr>
+          <w:top w:val="single" w:color="0061C7" w:sz="8" w:space="6"/>
+          <w:left w:val="single" w:color="0061C7" w:sz="8" w:space="6"/>
+          <w:right w:val="single" w:color="0061C7" w:sz="8" w:space="6"/>
+        </w:pBdr>
+        <w:shd w:fill="D9E7F7" w:color="auto" w:val="clear"/>
+        <w:spacing w:after="0" w:before="240" w:line="300"/>
+        <w:ind w:left="160" w:right="160"/>
+      </w:pPr>
+      <w:r>
+        <w:rPr>
+          <w:b/>
+          <w:bCs/>
+          <w:color w:val="2C3A87"/>
           <w:sz w:val="24"/>
           <w:szCs w:val="24"/>
         </w:rPr>
-        <w:t xml:space="preserve">Section: Help</w:t>
-      </w:r>
-    </w:p>
-    <w:p>
-      <w:pPr>
-        <w:pStyle w:val="Heading1"/>
+        <w:t xml:space="preserve">Card Services › Activate Card</w:t>
+      </w:r>
+    </w:p>
+    <w:p>
+      <w:pPr>
         <w:pBdr>
-          <w:bottom w:val="single" w:color="92E773" w:sz="12" w:space="4"/>
+          <w:bottom w:val="single" w:color="0061C7" w:sz="8" w:space="6"/>
+          <w:left w:val="single" w:color="0061C7" w:sz="8" w:space="6"/>
+          <w:right w:val="single" w:color="0061C7" w:sz="8" w:space="6"/>
         </w:pBdr>
-        <w:spacing w:after="160" w:before="320"/>
-      </w:pPr>
-      <w:r>
-        <w:rPr>
-          <w:b/>
-          <w:bCs/>
-          <w:color w:val="254498"/>
-          <w:sz w:val="30"/>
-          <w:szCs w:val="30"/>
-        </w:rPr>
-        <w:t xml:space="preserve">Help</w:t>
-      </w:r>
-    </w:p>
-    <w:p>
-      <w:pPr>
-        <w:pStyle w:val="Heading2"/>
-        <w:shd w:fill="D8DDED" w:color="auto" w:val="clear"/>
-        <w:spacing w:after="0" w:before="300" w:line="300"/>
-      </w:pPr>
-      <w:r>
-        <w:rPr>
-          <w:b/>
-          <w:bCs/>
-          <w:color w:val="254498"/>
-          <w:sz w:val="26"/>
-          <w:szCs w:val="26"/>
-        </w:rPr>
-        <w:t xml:space="preserve">Help › Activate Card</w:t>
-      </w:r>
-    </w:p>
-    <w:p>
-      <w:pPr>
-        <w:shd w:fill="D8DDED" w:color="auto" w:val="clear"/>
+        <w:shd w:fill="D9E7F7" w:color="auto" w:val="clear"/>
         <w:spacing w:after="200" w:before="0" w:line="260"/>
+        <w:ind w:left="160" w:right="160"/>
       </w:pPr>
       <w:r>
         <w:rPr>
           <w:i/>
           <w:iCs/>
-          <w:color w:val="254498"/>
+          <w:color w:val="2C3A87"/>
           <w:sz w:val="18"/>
           <w:szCs w:val="18"/>
         </w:rPr>
-        <w:t xml:space="preserve">Source: https://www.sc.com/sg/help/activate-card/</w:t>
-      </w:r>
-    </w:p>
-    <w:p>
-      <w:pPr>
-        <w:spacing w:after="60" w:before="200"/>
-      </w:pPr>
-      <w:r>
-        <w:rPr>
-          <w:b/>
-          <w:bCs/>
-          <w:color w:val="254498"/>
+        <w:t xml:space="preserve">Source: </w:t>
+      </w:r>
+      <w:hyperlink w:history="1" r:id="rIdul-ua7qf1xoffv0bfr5ci">
+        <w:r>
+          <w:rPr>
+            <w:i/>
+            <w:iCs/>
+            <w:color w:val="0061C7"/>
+            <w:sz w:val="18"/>
+            <w:szCs w:val="18"/>
+            <w:u w:val="single"/>
+          </w:rPr>
+          <w:t xml:space="preserve">https://www.sc.com/sg/help/activate-card/</w:t>
+        </w:r>
+      </w:hyperlink>
+    </w:p>
+    <w:p>
+      <w:pPr>
+        <w:spacing w:after="60" w:before="220"/>
+      </w:pPr>
+      <w:r>
+        <w:rPr>
+          <w:b/>
+          <w:bCs/>
+          <w:color w:val="0061C7"/>
           <w:sz w:val="22"/>
           <w:szCs w:val="22"/>
         </w:rPr>
@@ -106,7 +133,7 @@
         <w:rPr>
           <w:b/>
           <w:bCs/>
-          <w:color w:val="262626"/>
+          <w:color w:val="000000"/>
           <w:sz w:val="22"/>
           <w:szCs w:val="22"/>
         </w:rPr>
@@ -121,7 +148,7 @@
         <w:rPr>
           <w:b/>
           <w:bCs/>
-          <w:color w:val="254498"/>
+          <w:color w:val="0061C7"/>
           <w:sz w:val="22"/>
           <w:szCs w:val="22"/>
         </w:rPr>
@@ -129,7 +156,9 @@
       </w:r>
       <w:r>
         <w:rPr>
-          <w:color w:val="262626"/>
+          <w:b w:val="false"/>
+          <w:bCs w:val="false"/>
+          <w:color w:val="000000"/>
           <w:sz w:val="22"/>
           <w:szCs w:val="22"/>
         </w:rPr>
@@ -138,13 +167,13 @@
     </w:p>
     <w:p>
       <w:pPr>
-        <w:spacing w:after="60" w:before="200"/>
-      </w:pPr>
-      <w:r>
-        <w:rPr>
-          <w:b/>
-          <w:bCs/>
-          <w:color w:val="254498"/>
+        <w:spacing w:after="60" w:before="220"/>
+      </w:pPr>
+      <w:r>
+        <w:rPr>
+          <w:b/>
+          <w:bCs/>
+          <w:color w:val="0061C7"/>
           <w:sz w:val="22"/>
           <w:szCs w:val="22"/>
         </w:rPr>
@@ -154,7 +183,7 @@
         <w:rPr>
           <w:b/>
           <w:bCs/>
-          <w:color w:val="262626"/>
+          <w:color w:val="000000"/>
           <w:sz w:val="22"/>
           <w:szCs w:val="22"/>
         </w:rPr>
@@ -169,7 +198,7 @@
         <w:rPr>
           <w:b/>
           <w:bCs/>
-          <w:color w:val="254498"/>
+          <w:color w:val="0061C7"/>
           <w:sz w:val="22"/>
           <w:szCs w:val="22"/>
         </w:rPr>
@@ -177,7 +206,9 @@
       </w:r>
       <w:r>
         <w:rPr>
-          <w:color w:val="262626"/>
+          <w:b w:val="false"/>
+          <w:bCs w:val="false"/>
+          <w:color w:val="000000"/>
           <w:sz w:val="22"/>
           <w:szCs w:val="22"/>
         </w:rPr>
@@ -195,7 +226,9 @@
       </w:pPr>
       <w:r>
         <w:rPr>
-          <w:color w:val="262626"/>
+          <w:b w:val="false"/>
+          <w:bCs w:val="false"/>
+          <w:color w:val="000000"/>
           <w:sz w:val="22"/>
           <w:szCs w:val="22"/>
         </w:rPr>
@@ -213,7 +246,9 @@
       </w:pPr>
       <w:r>
         <w:rPr>
-          <w:color w:val="262626"/>
+          <w:b w:val="false"/>
+          <w:bCs w:val="false"/>
+          <w:color w:val="000000"/>
           <w:sz w:val="22"/>
           <w:szCs w:val="22"/>
         </w:rPr>
@@ -222,13 +257,13 @@
     </w:p>
     <w:p>
       <w:pPr>
-        <w:spacing w:after="60" w:before="200"/>
-      </w:pPr>
-      <w:r>
-        <w:rPr>
-          <w:b/>
-          <w:bCs/>
-          <w:color w:val="254498"/>
+        <w:spacing w:after="60" w:before="220"/>
+      </w:pPr>
+      <w:r>
+        <w:rPr>
+          <w:b/>
+          <w:bCs/>
+          <w:color w:val="0061C7"/>
           <w:sz w:val="22"/>
           <w:szCs w:val="22"/>
         </w:rPr>
@@ -238,7 +273,7 @@
         <w:rPr>
           <w:b/>
           <w:bCs/>
-          <w:color w:val="262626"/>
+          <w:color w:val="000000"/>
           <w:sz w:val="22"/>
           <w:szCs w:val="22"/>
         </w:rPr>
@@ -253,7 +288,7 @@
         <w:rPr>
           <w:b/>
           <w:bCs/>
-          <w:color w:val="254498"/>
+          <w:color w:val="0061C7"/>
           <w:sz w:val="22"/>
           <w:szCs w:val="22"/>
         </w:rPr>
@@ -261,22 +296,66 @@
       </w:r>
       <w:r>
         <w:rPr>
-          <w:color w:val="262626"/>
-          <w:sz w:val="22"/>
-          <w:szCs w:val="22"/>
-        </w:rPr>
-        <w:t xml:space="preserve">To update a registered mobile number, log in to Online Banking or SC Mobile and go to “Update Profile Details”.</w:t>
-      </w:r>
-    </w:p>
-    <w:p>
-      <w:pPr>
-        <w:spacing w:after="60" w:before="200"/>
-      </w:pPr>
-      <w:r>
-        <w:rPr>
-          <w:b/>
-          <w:bCs/>
-          <w:color w:val="254498"/>
+          <w:b w:val="false"/>
+          <w:bCs w:val="false"/>
+          <w:color w:val="000000"/>
+          <w:sz w:val="22"/>
+          <w:szCs w:val="22"/>
+        </w:rPr>
+        <w:t xml:space="preserve">To update a registered mobile number, log in to </w:t>
+      </w:r>
+      <w:hyperlink w:history="1" r:id="rId6ncvoejtwrldyhkbxqdj0">
+        <w:r>
+          <w:rPr>
+            <w:color w:val="0061C7"/>
+            <w:sz w:val="22"/>
+            <w:szCs w:val="22"/>
+            <w:u w:val="single"/>
+          </w:rPr>
+          <w:t xml:space="preserve">Online Banking</w:t>
+        </w:r>
+      </w:hyperlink>
+      <w:r>
+        <w:rPr>
+          <w:b w:val="false"/>
+          <w:bCs w:val="false"/>
+          <w:color w:val="000000"/>
+          <w:sz w:val="22"/>
+          <w:szCs w:val="22"/>
+        </w:rPr>
+        <w:t xml:space="preserve"> or </w:t>
+      </w:r>
+      <w:hyperlink w:history="1" r:id="rId6nn5h_adcmx8rqitskjkr">
+        <w:r>
+          <w:rPr>
+            <w:color w:val="0061C7"/>
+            <w:sz w:val="22"/>
+            <w:szCs w:val="22"/>
+            <w:u w:val="single"/>
+          </w:rPr>
+          <w:t xml:space="preserve">SC Mobile</w:t>
+        </w:r>
+      </w:hyperlink>
+      <w:r>
+        <w:rPr>
+          <w:b w:val="false"/>
+          <w:bCs w:val="false"/>
+          <w:color w:val="000000"/>
+          <w:sz w:val="22"/>
+          <w:szCs w:val="22"/>
+        </w:rPr>
+        <w:t xml:space="preserve"> and go to “Update Profile Details”.</w:t>
+      </w:r>
+    </w:p>
+    <w:p>
+      <w:pPr>
+        <w:spacing w:after="60" w:before="220"/>
+      </w:pPr>
+      <w:r>
+        <w:rPr>
+          <w:b/>
+          <w:bCs/>
+          <w:color w:val="0061C7"/>
           <w:sz w:val="22"/>
           <w:szCs w:val="22"/>
         </w:rPr>
@@ -286,7 +365,7 @@
         <w:rPr>
           <w:b/>
           <w:bCs/>
-          <w:color w:val="262626"/>
+          <w:color w:val="000000"/>
           <w:sz w:val="22"/>
           <w:szCs w:val="22"/>
         </w:rPr>
@@ -301,7 +380,7 @@
         <w:rPr>
           <w:b/>
           <w:bCs/>
-          <w:color w:val="254498"/>
+          <w:color w:val="0061C7"/>
           <w:sz w:val="22"/>
           <w:szCs w:val="22"/>
         </w:rPr>
@@ -309,7 +388,9 @@
       </w:r>
       <w:r>
         <w:rPr>
-          <w:color w:val="262626"/>
+          <w:b w:val="false"/>
+          <w:bCs w:val="false"/>
+          <w:color w:val="000000"/>
           <w:sz w:val="22"/>
           <w:szCs w:val="22"/>
         </w:rPr>
@@ -318,13 +399,13 @@
     </w:p>
     <w:p>
       <w:pPr>
-        <w:spacing w:after="60" w:before="200"/>
-      </w:pPr>
-      <w:r>
-        <w:rPr>
-          <w:b/>
-          <w:bCs/>
-          <w:color w:val="254498"/>
+        <w:spacing w:after="60" w:before="220"/>
+      </w:pPr>
+      <w:r>
+        <w:rPr>
+          <w:b/>
+          <w:bCs/>
+          <w:color w:val="0061C7"/>
           <w:sz w:val="22"/>
           <w:szCs w:val="22"/>
         </w:rPr>
@@ -334,7 +415,7 @@
         <w:rPr>
           <w:b/>
           <w:bCs/>
-          <w:color w:val="262626"/>
+          <w:color w:val="000000"/>
           <w:sz w:val="22"/>
           <w:szCs w:val="22"/>
         </w:rPr>
@@ -349,7 +430,7 @@
         <w:rPr>
           <w:b/>
           <w:bCs/>
-          <w:color w:val="254498"/>
+          <w:color w:val="0061C7"/>
           <w:sz w:val="22"/>
           <w:szCs w:val="22"/>
         </w:rPr>
@@ -357,25 +438,71 @@
       </w:r>
       <w:r>
         <w:rPr>
-          <w:color w:val="262626"/>
-          <w:sz w:val="22"/>
-          <w:szCs w:val="22"/>
-        </w:rPr>
-        <w:t xml:space="preserve">A Standard Chartered ATM, debit or credit card can be activated and its PIN set through Online Banking or SC Mobile using these steps:</w:t>
-      </w:r>
-    </w:p>
-    <w:p>
-      <w:pPr>
-        <w:pStyle w:val="ListParagraph"/>
-        <w:numPr>
-          <w:ilvl w:val="0"/>
-          <w:numId w:val="2"/>
-        </w:numPr>
-        <w:spacing w:after="20" w:before="20"/>
-      </w:pPr>
-      <w:r>
-        <w:rPr>
-          <w:color w:val="262626"/>
+          <w:b w:val="false"/>
+          <w:bCs w:val="false"/>
+          <w:color w:val="000000"/>
+          <w:sz w:val="22"/>
+          <w:szCs w:val="22"/>
+        </w:rPr>
+        <w:t xml:space="preserve">A Standard Chartered ATM, debit or credit card can be activated and its PIN set through </w:t>
+      </w:r>
+      <w:hyperlink w:history="1" r:id="rIdp7bapsgqtvv0c6d8tvq1u">
+        <w:r>
+          <w:rPr>
+            <w:color w:val="0061C7"/>
+            <w:sz w:val="22"/>
+            <w:szCs w:val="22"/>
+            <w:u w:val="single"/>
+          </w:rPr>
+          <w:t xml:space="preserve">Online Banking</w:t>
+        </w:r>
+      </w:hyperlink>
+      <w:r>
+        <w:rPr>
+          <w:b w:val="false"/>
+          <w:bCs w:val="false"/>
+          <w:color w:val="000000"/>
+          <w:sz w:val="22"/>
+          <w:szCs w:val="22"/>
+        </w:rPr>
+        <w:t xml:space="preserve"> or </w:t>
+      </w:r>
+      <w:hyperlink w:history="1" r:id="rIdiozcyzgampw08itr5zzog">
+        <w:r>
+          <w:rPr>
+            <w:color w:val="0061C7"/>
+            <w:sz w:val="22"/>
+            <w:szCs w:val="22"/>
+            <w:u w:val="single"/>
+          </w:rPr>
+          <w:t xml:space="preserve">SC Mobile</w:t>
+        </w:r>
+      </w:hyperlink>
+      <w:r>
+        <w:rPr>
+          <w:b w:val="false"/>
+          <w:bCs w:val="false"/>
+          <w:color w:val="000000"/>
+          <w:sz w:val="22"/>
+          <w:szCs w:val="22"/>
+        </w:rPr>
+        <w:t xml:space="preserve"> using these steps:</w:t>
+      </w:r>
+    </w:p>
+    <w:p>
+      <w:pPr>
+        <w:pStyle w:val="ListParagraph"/>
+        <w:numPr>
+          <w:ilvl w:val="0"/>
+          <w:numId w:val="2"/>
+        </w:numPr>
+        <w:spacing w:after="20" w:before="20"/>
+      </w:pPr>
+      <w:r>
+        <w:rPr>
+          <w:b w:val="false"/>
+          <w:bCs w:val="false"/>
+          <w:color w:val="000000"/>
           <w:sz w:val="22"/>
           <w:szCs w:val="22"/>
         </w:rPr>
@@ -393,7 +520,9 @@
       </w:pPr>
       <w:r>
         <w:rPr>
-          <w:color w:val="262626"/>
+          <w:b w:val="false"/>
+          <w:bCs w:val="false"/>
+          <w:color w:val="000000"/>
           <w:sz w:val="22"/>
           <w:szCs w:val="22"/>
         </w:rPr>
@@ -411,7 +540,9 @@
       </w:pPr>
       <w:r>
         <w:rPr>
-          <w:color w:val="262626"/>
+          <w:b w:val="false"/>
+          <w:bCs w:val="false"/>
+          <w:color w:val="000000"/>
           <w:sz w:val="22"/>
           <w:szCs w:val="22"/>
         </w:rPr>
@@ -429,7 +560,9 @@
       </w:pPr>
       <w:r>
         <w:rPr>
-          <w:color w:val="262626"/>
+          <w:b w:val="false"/>
+          <w:bCs w:val="false"/>
+          <w:color w:val="000000"/>
           <w:sz w:val="22"/>
           <w:szCs w:val="22"/>
         </w:rPr>
@@ -447,7 +580,9 @@
       </w:pPr>
       <w:r>
         <w:rPr>
-          <w:color w:val="262626"/>
+          <w:b w:val="false"/>
+          <w:bCs w:val="false"/>
+          <w:color w:val="000000"/>
           <w:sz w:val="22"/>
           <w:szCs w:val="22"/>
         </w:rPr>
@@ -456,26 +591,13 @@
     </w:p>
     <w:p>
       <w:pPr>
-        <w:spacing w:after="60" w:before="80"/>
-      </w:pPr>
-      <w:r>
-        <w:rPr>
-          <w:color w:val="262626"/>
-          <w:sz w:val="22"/>
-          <w:szCs w:val="22"/>
-        </w:rPr>
-        <w:t xml:space="preserve">SC Mobile can be downloaded free of charge from the App Store (iOS) or Google Play (Android).</w:t>
-      </w:r>
-    </w:p>
-    <w:p>
-      <w:pPr>
-        <w:spacing w:after="60" w:before="200"/>
-      </w:pPr>
-      <w:r>
-        <w:rPr>
-          <w:b/>
-          <w:bCs/>
-          <w:color w:val="254498"/>
+        <w:spacing w:after="60" w:before="220"/>
+      </w:pPr>
+      <w:r>
+        <w:rPr>
+          <w:b/>
+          <w:bCs/>
+          <w:color w:val="0061C7"/>
           <w:sz w:val="22"/>
           <w:szCs w:val="22"/>
         </w:rPr>
@@ -485,7 +607,212 @@
         <w:rPr>
           <w:b/>
           <w:bCs/>
-          <w:color w:val="262626"/>
+          <w:color w:val="000000"/>
+          <w:sz w:val="22"/>
+          <w:szCs w:val="22"/>
+        </w:rPr>
+        <w:t xml:space="preserve">Where can a Standard Chartered card be activated online without logging in to Online Banking or SC Mobile?</w:t>
+      </w:r>
+    </w:p>
+    <w:p>
+      <w:pPr>
+        <w:spacing w:after="60" w:before="0"/>
+      </w:pPr>
+      <w:r>
+        <w:rPr>
+          <w:b/>
+          <w:bCs/>
+          <w:color w:val="0061C7"/>
+          <w:sz w:val="22"/>
+          <w:szCs w:val="22"/>
+        </w:rPr>
+        <w:t xml:space="preserve">A6: </w:t>
+      </w:r>
+      <w:r>
+        <w:rPr>
+          <w:b w:val="false"/>
+          <w:bCs w:val="false"/>
+          <w:color w:val="000000"/>
+          <w:sz w:val="22"/>
+          <w:szCs w:val="22"/>
+        </w:rPr>
+        <w:t xml:space="preserve">A Standard Chartered card can also be activated through the Bank’s online card activation form at </w:t>
+      </w:r>
+      <w:hyperlink w:history="1" r:id="rId53jjz_oovqejvuaa0twux">
+        <w:r>
+          <w:rPr>
+            <w:color w:val="0061C7"/>
+            <w:sz w:val="22"/>
+            <w:szCs w:val="22"/>
+            <w:u w:val="single"/>
+          </w:rPr>
+          <w:t xml:space="preserve">forms.online.standardchartered.com</w:t>
+        </w:r>
+      </w:hyperlink>
+      <w:r>
+        <w:rPr>
+          <w:b w:val="false"/>
+          <w:bCs w:val="false"/>
+          <w:color w:val="000000"/>
+          <w:sz w:val="22"/>
+          <w:szCs w:val="22"/>
+        </w:rPr>
+        <w:t xml:space="preserve">. Further answers on card activation are published at </w:t>
+      </w:r>
+      <w:hyperlink w:history="1" r:id="rIdpdhgutnx5cpkley7k0ftl">
+        <w:r>
+          <w:rPr>
+            <w:color w:val="0061C7"/>
+            <w:sz w:val="22"/>
+            <w:szCs w:val="22"/>
+            <w:u w:val="single"/>
+          </w:rPr>
+          <w:t xml:space="preserve">sc.com/sg/help/faqs/activate-new-card</w:t>
+        </w:r>
+      </w:hyperlink>
+      <w:r>
+        <w:rPr>
+          <w:b w:val="false"/>
+          <w:bCs w:val="false"/>
+          <w:color w:val="000000"/>
+          <w:sz w:val="22"/>
+          <w:szCs w:val="22"/>
+        </w:rPr>
+        <w:t xml:space="preserve">, and general guidance is available on the Association of Banks in Singapore website at </w:t>
+      </w:r>
+      <w:hyperlink w:history="1" r:id="rIdj5dzvwg8wksosn_l6shwn">
+        <w:r>
+          <w:rPr>
+            <w:color w:val="0061C7"/>
+            <w:sz w:val="22"/>
+            <w:szCs w:val="22"/>
+            <w:u w:val="single"/>
+          </w:rPr>
+          <w:t xml:space="preserve">abs.org.sg</w:t>
+        </w:r>
+      </w:hyperlink>
+      <w:r>
+        <w:rPr>
+          <w:b w:val="false"/>
+          <w:bCs w:val="false"/>
+          <w:color w:val="000000"/>
+          <w:sz w:val="22"/>
+          <w:szCs w:val="22"/>
+        </w:rPr>
+        <w:t xml:space="preserve">.</w:t>
+      </w:r>
+    </w:p>
+    <w:p>
+      <w:pPr>
+        <w:spacing w:after="60" w:before="220"/>
+      </w:pPr>
+      <w:r>
+        <w:rPr>
+          <w:b/>
+          <w:bCs/>
+          <w:color w:val="0061C7"/>
+          <w:sz w:val="22"/>
+          <w:szCs w:val="22"/>
+        </w:rPr>
+        <w:t xml:space="preserve">Q7: </w:t>
+      </w:r>
+      <w:r>
+        <w:rPr>
+          <w:b/>
+          <w:bCs/>
+          <w:color w:val="000000"/>
+          <w:sz w:val="22"/>
+          <w:szCs w:val="22"/>
+        </w:rPr>
+        <w:t xml:space="preserve">Where can SC Mobile be downloaded?</w:t>
+      </w:r>
+    </w:p>
+    <w:p>
+      <w:pPr>
+        <w:spacing w:after="60" w:before="0"/>
+      </w:pPr>
+      <w:r>
+        <w:rPr>
+          <w:b/>
+          <w:bCs/>
+          <w:color w:val="0061C7"/>
+          <w:sz w:val="22"/>
+          <w:szCs w:val="22"/>
+        </w:rPr>
+        <w:t xml:space="preserve">A7: </w:t>
+      </w:r>
+      <w:r>
+        <w:rPr>
+          <w:b w:val="false"/>
+          <w:bCs w:val="false"/>
+          <w:color w:val="000000"/>
+          <w:sz w:val="22"/>
+          <w:szCs w:val="22"/>
+        </w:rPr>
+        <w:t xml:space="preserve">SC Mobile is Standard Chartered’s mobile banking app and is available free of charge on the </w:t>
+      </w:r>
+      <w:hyperlink w:history="1" r:id="rIdn_2abbrtqe5guszqmjuer">
+        <w:r>
+          <w:rPr>
+            <w:color w:val="0061C7"/>
+            <w:sz w:val="22"/>
+            <w:szCs w:val="22"/>
+            <w:u w:val="single"/>
+          </w:rPr>
+          <w:t xml:space="preserve">App Store (iOS)</w:t>
+        </w:r>
+      </w:hyperlink>
+      <w:r>
+        <w:rPr>
+          <w:b w:val="false"/>
+          <w:bCs w:val="false"/>
+          <w:color w:val="000000"/>
+          <w:sz w:val="22"/>
+          <w:szCs w:val="22"/>
+        </w:rPr>
+        <w:t xml:space="preserve"> and </w:t>
+      </w:r>
+      <w:hyperlink w:history="1" r:id="rIdk1zxxhzp2bfsaxt3v0wby">
+        <w:r>
+          <w:rPr>
+            <w:color w:val="0061C7"/>
+            <w:sz w:val="22"/>
+            <w:szCs w:val="22"/>
+            <w:u w:val="single"/>
+          </w:rPr>
+          <w:t xml:space="preserve">Google Play (Android)</w:t>
+        </w:r>
+      </w:hyperlink>
+      <w:r>
+        <w:rPr>
+          <w:b w:val="false"/>
+          <w:bCs w:val="false"/>
+          <w:color w:val="000000"/>
+          <w:sz w:val="22"/>
+          <w:szCs w:val="22"/>
+        </w:rPr>
+        <w:t xml:space="preserve">. App Store is a trademark of Apple Inc. registered in the US and other countries. Android is a trademark of Google Inc.</w:t>
+      </w:r>
+    </w:p>
+    <w:p>
+      <w:pPr>
+        <w:spacing w:after="60" w:before="220"/>
+      </w:pPr>
+      <w:r>
+        <w:rPr>
+          <w:b/>
+          <w:bCs/>
+          <w:color w:val="0061C7"/>
+          <w:sz w:val="22"/>
+          <w:szCs w:val="22"/>
+        </w:rPr>
+        <w:t xml:space="preserve">Q8: </w:t>
+      </w:r>
+      <w:r>
+        <w:rPr>
+          <w:b/>
+          <w:bCs/>
+          <w:color w:val="000000"/>
           <w:sz w:val="22"/>
           <w:szCs w:val="22"/>
         </w:rPr>
@@ -500,15 +827,17 @@
         <w:rPr>
           <w:b/>
           <w:bCs/>
-          <w:color w:val="254498"/>
-          <w:sz w:val="22"/>
-          <w:szCs w:val="22"/>
-        </w:rPr>
-        <w:t xml:space="preserve">A6: </w:t>
-      </w:r>
-      <w:r>
-        <w:rPr>
-          <w:color w:val="262626"/>
+          <w:color w:val="0061C7"/>
+          <w:sz w:val="22"/>
+          <w:szCs w:val="22"/>
+        </w:rPr>
+        <w:t xml:space="preserve">A8: </w:t>
+      </w:r>
+      <w:r>
+        <w:rPr>
+          <w:b w:val="false"/>
+          <w:bCs w:val="false"/>
+          <w:color w:val="000000"/>
           <w:sz w:val="22"/>
           <w:szCs w:val="22"/>
         </w:rPr>
@@ -517,23 +846,23 @@
     </w:p>
     <w:p>
       <w:pPr>
-        <w:spacing w:after="60" w:before="200"/>
-      </w:pPr>
-      <w:r>
-        <w:rPr>
-          <w:b/>
-          <w:bCs/>
-          <w:color w:val="254498"/>
-          <w:sz w:val="22"/>
-          <w:szCs w:val="22"/>
-        </w:rPr>
-        <w:t xml:space="preserve">Q7: </w:t>
-      </w:r>
-      <w:r>
-        <w:rPr>
-          <w:b/>
-          <w:bCs/>
-          <w:color w:val="262626"/>
+        <w:spacing w:after="60" w:before="220"/>
+      </w:pPr>
+      <w:r>
+        <w:rPr>
+          <w:b/>
+          <w:bCs/>
+          <w:color w:val="0061C7"/>
+          <w:sz w:val="22"/>
+          <w:szCs w:val="22"/>
+        </w:rPr>
+        <w:t xml:space="preserve">Q9: </w:t>
+      </w:r>
+      <w:r>
+        <w:rPr>
+          <w:b/>
+          <w:bCs/>
+          <w:color w:val="000000"/>
           <w:sz w:val="22"/>
           <w:szCs w:val="22"/>
         </w:rPr>
@@ -548,15 +877,17 @@
         <w:rPr>
           <w:b/>
           <w:bCs/>
-          <w:color w:val="254498"/>
-          <w:sz w:val="22"/>
-          <w:szCs w:val="22"/>
-        </w:rPr>
-        <w:t xml:space="preserve">A7: </w:t>
-      </w:r>
-      <w:r>
-        <w:rPr>
-          <w:color w:val="262626"/>
+          <w:color w:val="0061C7"/>
+          <w:sz w:val="22"/>
+          <w:szCs w:val="22"/>
+        </w:rPr>
+        <w:t xml:space="preserve">A9: </w:t>
+      </w:r>
+      <w:r>
+        <w:rPr>
+          <w:b w:val="false"/>
+          <w:bCs w:val="false"/>
+          <w:color w:val="000000"/>
           <w:sz w:val="22"/>
           <w:szCs w:val="22"/>
         </w:rPr>
@@ -565,23 +896,23 @@
     </w:p>
     <w:p>
       <w:pPr>
-        <w:spacing w:after="60" w:before="200"/>
-      </w:pPr>
-      <w:r>
-        <w:rPr>
-          <w:b/>
-          <w:bCs/>
-          <w:color w:val="254498"/>
-          <w:sz w:val="22"/>
-          <w:szCs w:val="22"/>
-        </w:rPr>
-        <w:t xml:space="preserve">Q8: </w:t>
-      </w:r>
-      <w:r>
-        <w:rPr>
-          <w:b/>
-          <w:bCs/>
-          <w:color w:val="262626"/>
+        <w:spacing w:after="60" w:before="220"/>
+      </w:pPr>
+      <w:r>
+        <w:rPr>
+          <w:b/>
+          <w:bCs/>
+          <w:color w:val="0061C7"/>
+          <w:sz w:val="22"/>
+          <w:szCs w:val="22"/>
+        </w:rPr>
+        <w:t xml:space="preserve">Q10: </w:t>
+      </w:r>
+      <w:r>
+        <w:rPr>
+          <w:b/>
+          <w:bCs/>
+          <w:color w:val="000000"/>
           <w:sz w:val="22"/>
           <w:szCs w:val="22"/>
         </w:rPr>
@@ -596,15 +927,17 @@
         <w:rPr>
           <w:b/>
           <w:bCs/>
-          <w:color w:val="254498"/>
-          <w:sz w:val="22"/>
-          <w:szCs w:val="22"/>
-        </w:rPr>
-        <w:t xml:space="preserve">A8: </w:t>
-      </w:r>
-      <w:r>
-        <w:rPr>
-          <w:color w:val="262626"/>
+          <w:color w:val="0061C7"/>
+          <w:sz w:val="22"/>
+          <w:szCs w:val="22"/>
+        </w:rPr>
+        <w:t xml:space="preserve">A10: </w:t>
+      </w:r>
+      <w:r>
+        <w:rPr>
+          <w:b w:val="false"/>
+          <w:bCs w:val="false"/>
+          <w:color w:val="000000"/>
           <w:sz w:val="22"/>
           <w:szCs w:val="22"/>
         </w:rPr>
@@ -622,7 +955,9 @@
       </w:pPr>
       <w:r>
         <w:rPr>
-          <w:color w:val="262626"/>
+          <w:b w:val="false"/>
+          <w:bCs w:val="false"/>
+          <w:color w:val="000000"/>
           <w:sz w:val="22"/>
           <w:szCs w:val="22"/>
         </w:rPr>
@@ -640,7 +975,9 @@
       </w:pPr>
       <w:r>
         <w:rPr>
-          <w:color w:val="262626"/>
+          <w:b w:val="false"/>
+          <w:bCs w:val="false"/>
+          <w:color w:val="000000"/>
           <w:sz w:val="22"/>
           <w:szCs w:val="22"/>
         </w:rPr>
@@ -649,23 +986,23 @@
     </w:p>
     <w:p>
       <w:pPr>
-        <w:spacing w:after="60" w:before="200"/>
-      </w:pPr>
-      <w:r>
-        <w:rPr>
-          <w:b/>
-          <w:bCs/>
-          <w:color w:val="254498"/>
-          <w:sz w:val="22"/>
-          <w:szCs w:val="22"/>
-        </w:rPr>
-        <w:t xml:space="preserve">Q9: </w:t>
-      </w:r>
-      <w:r>
-        <w:rPr>
-          <w:b/>
-          <w:bCs/>
-          <w:color w:val="262626"/>
+        <w:spacing w:after="60" w:before="220"/>
+      </w:pPr>
+      <w:r>
+        <w:rPr>
+          <w:b/>
+          <w:bCs/>
+          <w:color w:val="0061C7"/>
+          <w:sz w:val="22"/>
+          <w:szCs w:val="22"/>
+        </w:rPr>
+        <w:t xml:space="preserve">Q11: </w:t>
+      </w:r>
+      <w:r>
+        <w:rPr>
+          <w:b/>
+          <w:bCs/>
+          <w:color w:val="000000"/>
           <w:sz w:val="22"/>
           <w:szCs w:val="22"/>
         </w:rPr>
@@ -680,15 +1017,17 @@
         <w:rPr>
           <w:b/>
           <w:bCs/>
-          <w:color w:val="254498"/>
-          <w:sz w:val="22"/>
-          <w:szCs w:val="22"/>
-        </w:rPr>
-        <w:t xml:space="preserve">A9: </w:t>
-      </w:r>
-      <w:r>
-        <w:rPr>
-          <w:color w:val="262626"/>
+          <w:color w:val="0061C7"/>
+          <w:sz w:val="22"/>
+          <w:szCs w:val="22"/>
+        </w:rPr>
+        <w:t xml:space="preserve">A11: </w:t>
+      </w:r>
+      <w:r>
+        <w:rPr>
+          <w:b w:val="false"/>
+          <w:bCs w:val="false"/>
+          <w:color w:val="000000"/>
           <w:sz w:val="22"/>
           <w:szCs w:val="22"/>
         </w:rPr>
@@ -706,7 +1045,9 @@
       </w:pPr>
       <w:r>
         <w:rPr>
-          <w:color w:val="262626"/>
+          <w:b w:val="false"/>
+          <w:bCs w:val="false"/>
+          <w:color w:val="000000"/>
           <w:sz w:val="22"/>
           <w:szCs w:val="22"/>
         </w:rPr>
@@ -724,7 +1065,9 @@
       </w:pPr>
       <w:r>
         <w:rPr>
-          <w:color w:val="262626"/>
+          <w:b w:val="false"/>
+          <w:bCs w:val="false"/>
+          <w:color w:val="000000"/>
           <w:sz w:val="22"/>
           <w:szCs w:val="22"/>
         </w:rPr>
@@ -733,23 +1076,23 @@
     </w:p>
     <w:p>
       <w:pPr>
-        <w:spacing w:after="60" w:before="200"/>
-      </w:pPr>
-      <w:r>
-        <w:rPr>
-          <w:b/>
-          <w:bCs/>
-          <w:color w:val="254498"/>
-          <w:sz w:val="22"/>
-          <w:szCs w:val="22"/>
-        </w:rPr>
-        <w:t xml:space="preserve">Q10: </w:t>
-      </w:r>
-      <w:r>
-        <w:rPr>
-          <w:b/>
-          <w:bCs/>
-          <w:color w:val="262626"/>
+        <w:spacing w:after="60" w:before="220"/>
+      </w:pPr>
+      <w:r>
+        <w:rPr>
+          <w:b/>
+          <w:bCs/>
+          <w:color w:val="0061C7"/>
+          <w:sz w:val="22"/>
+          <w:szCs w:val="22"/>
+        </w:rPr>
+        <w:t xml:space="preserve">Q12: </w:t>
+      </w:r>
+      <w:r>
+        <w:rPr>
+          <w:b/>
+          <w:bCs/>
+          <w:color w:val="000000"/>
           <w:sz w:val="22"/>
           <w:szCs w:val="22"/>
         </w:rPr>
@@ -764,15 +1107,17 @@
         <w:rPr>
           <w:b/>
           <w:bCs/>
-          <w:color w:val="254498"/>
-          <w:sz w:val="22"/>
-          <w:szCs w:val="22"/>
-        </w:rPr>
-        <w:t xml:space="preserve">A10: </w:t>
-      </w:r>
-      <w:r>
-        <w:rPr>
-          <w:color w:val="262626"/>
+          <w:color w:val="0061C7"/>
+          <w:sz w:val="22"/>
+          <w:szCs w:val="22"/>
+        </w:rPr>
+        <w:t xml:space="preserve">A12: </w:t>
+      </w:r>
+      <w:r>
+        <w:rPr>
+          <w:b w:val="false"/>
+          <w:bCs w:val="false"/>
+          <w:color w:val="000000"/>
           <w:sz w:val="22"/>
           <w:szCs w:val="22"/>
         </w:rPr>
@@ -781,23 +1126,23 @@
     </w:p>
     <w:p>
       <w:pPr>
-        <w:spacing w:after="60" w:before="200"/>
-      </w:pPr>
-      <w:r>
-        <w:rPr>
-          <w:b/>
-          <w:bCs/>
-          <w:color w:val="254498"/>
-          <w:sz w:val="22"/>
-          <w:szCs w:val="22"/>
-        </w:rPr>
-        <w:t xml:space="preserve">Q11: </w:t>
-      </w:r>
-      <w:r>
-        <w:rPr>
-          <w:b/>
-          <w:bCs/>
-          <w:color w:val="262626"/>
+        <w:spacing w:after="60" w:before="220"/>
+      </w:pPr>
+      <w:r>
+        <w:rPr>
+          <w:b/>
+          <w:bCs/>
+          <w:color w:val="0061C7"/>
+          <w:sz w:val="22"/>
+          <w:szCs w:val="22"/>
+        </w:rPr>
+        <w:t xml:space="preserve">Q13: </w:t>
+      </w:r>
+      <w:r>
+        <w:rPr>
+          <w:b/>
+          <w:bCs/>
+          <w:color w:val="000000"/>
           <w:sz w:val="22"/>
           <w:szCs w:val="22"/>
         </w:rPr>
@@ -812,40 +1157,126 @@
         <w:rPr>
           <w:b/>
           <w:bCs/>
-          <w:color w:val="254498"/>
-          <w:sz w:val="22"/>
-          <w:szCs w:val="22"/>
-        </w:rPr>
-        <w:t xml:space="preserve">A11: </w:t>
-      </w:r>
-      <w:r>
-        <w:rPr>
-          <w:color w:val="262626"/>
-          <w:sz w:val="22"/>
-          <w:szCs w:val="22"/>
-        </w:rPr>
-        <w:t xml:space="preserve">Overseas card usage can be enabled or disabled through the Standard Chartered Singapore website or through SC Mobile, the Bank’s mobile banking app. This can only be done after the card has been activated. SC Mobile is available free of charge on the App Store (iOS) and Google Play (Android).</w:t>
-      </w:r>
-    </w:p>
-    <w:p>
-      <w:pPr>
-        <w:spacing w:after="60" w:before="200"/>
-      </w:pPr>
-      <w:r>
-        <w:rPr>
-          <w:b/>
-          <w:bCs/>
-          <w:color w:val="254498"/>
-          <w:sz w:val="22"/>
-          <w:szCs w:val="22"/>
-        </w:rPr>
-        <w:t xml:space="preserve">Q12: </w:t>
-      </w:r>
-      <w:r>
-        <w:rPr>
-          <w:b/>
-          <w:bCs/>
-          <w:color w:val="262626"/>
+          <w:color w:val="0061C7"/>
+          <w:sz w:val="22"/>
+          <w:szCs w:val="22"/>
+        </w:rPr>
+        <w:t xml:space="preserve">A13: </w:t>
+      </w:r>
+      <w:r>
+        <w:rPr>
+          <w:b w:val="false"/>
+          <w:bCs w:val="false"/>
+          <w:color w:val="000000"/>
+          <w:sz w:val="22"/>
+          <w:szCs w:val="22"/>
+        </w:rPr>
+        <w:t xml:space="preserve">Overseas card usage can be enabled or disabled using the Bank’s online form at </w:t>
+      </w:r>
+      <w:hyperlink w:history="1" r:id="rIdfpyuzjvybzmmd1wmwsw5m">
+        <w:r>
+          <w:rPr>
+            <w:color w:val="0061C7"/>
+            <w:sz w:val="22"/>
+            <w:szCs w:val="22"/>
+            <w:u w:val="single"/>
+          </w:rPr>
+          <w:t xml:space="preserve">online.forms.standardchartered.com</w:t>
+        </w:r>
+      </w:hyperlink>
+      <w:r>
+        <w:rPr>
+          <w:b w:val="false"/>
+          <w:bCs w:val="false"/>
+          <w:color w:val="000000"/>
+          <w:sz w:val="22"/>
+          <w:szCs w:val="22"/>
+        </w:rPr>
+        <w:t xml:space="preserve">, or through </w:t>
+      </w:r>
+      <w:hyperlink w:history="1" r:id="rIdisgbvosojolj11ywcn4zz">
+        <w:r>
+          <w:rPr>
+            <w:color w:val="0061C7"/>
+            <w:sz w:val="22"/>
+            <w:szCs w:val="22"/>
+            <w:u w:val="single"/>
+          </w:rPr>
+          <w:t xml:space="preserve">SC Mobile</w:t>
+        </w:r>
+      </w:hyperlink>
+      <w:r>
+        <w:rPr>
+          <w:b w:val="false"/>
+          <w:bCs w:val="false"/>
+          <w:color w:val="000000"/>
+          <w:sz w:val="22"/>
+          <w:szCs w:val="22"/>
+        </w:rPr>
+        <w:t xml:space="preserve">. This can only be done after the card has been activated. Further answers on overseas card usage are published at </w:t>
+      </w:r>
+      <w:hyperlink w:history="1" r:id="rIdzqudbbz-o4vh8no9vhyy5">
+        <w:r>
+          <w:rPr>
+            <w:color w:val="0061C7"/>
+            <w:sz w:val="22"/>
+            <w:szCs w:val="22"/>
+            <w:u w:val="single"/>
+          </w:rPr>
+          <w:t xml:space="preserve">sc.com/sg/help/faqs/activate-overseas-card-usage</w:t>
+        </w:r>
+      </w:hyperlink>
+      <w:r>
+        <w:rPr>
+          <w:b w:val="false"/>
+          <w:bCs w:val="false"/>
+          <w:color w:val="000000"/>
+          <w:sz w:val="22"/>
+          <w:szCs w:val="22"/>
+        </w:rPr>
+        <w:t xml:space="preserve">, and general guidance is available on the Association of Banks in Singapore website at </w:t>
+      </w:r>
+      <w:hyperlink w:history="1" r:id="rIdtndno9wxztnq4ls8fbwhr">
+        <w:r>
+          <w:rPr>
+            <w:color w:val="0061C7"/>
+            <w:sz w:val="22"/>
+            <w:szCs w:val="22"/>
+            <w:u w:val="single"/>
+          </w:rPr>
+          <w:t xml:space="preserve">abs.org.sg</w:t>
+        </w:r>
+      </w:hyperlink>
+      <w:r>
+        <w:rPr>
+          <w:b w:val="false"/>
+          <w:bCs w:val="false"/>
+          <w:color w:val="000000"/>
+          <w:sz w:val="22"/>
+          <w:szCs w:val="22"/>
+        </w:rPr>
+        <w:t xml:space="preserve">.</w:t>
+      </w:r>
+    </w:p>
+    <w:p>
+      <w:pPr>
+        <w:spacing w:after="60" w:before="220"/>
+      </w:pPr>
+      <w:r>
+        <w:rPr>
+          <w:b/>
+          <w:bCs/>
+          <w:color w:val="0061C7"/>
+          <w:sz w:val="22"/>
+          <w:szCs w:val="22"/>
+        </w:rPr>
+        <w:t xml:space="preserve">Q14: </w:t>
+      </w:r>
+      <w:r>
+        <w:rPr>
+          <w:b/>
+          <w:bCs/>
+          <w:color w:val="000000"/>
           <w:sz w:val="22"/>
           <w:szCs w:val="22"/>
         </w:rPr>
@@ -860,15 +1291,17 @@
         <w:rPr>
           <w:b/>
           <w:bCs/>
-          <w:color w:val="254498"/>
-          <w:sz w:val="22"/>
-          <w:szCs w:val="22"/>
-        </w:rPr>
-        <w:t xml:space="preserve">A12: </w:t>
-      </w:r>
-      <w:r>
-        <w:rPr>
-          <w:color w:val="262626"/>
+          <w:color w:val="0061C7"/>
+          <w:sz w:val="22"/>
+          <w:szCs w:val="22"/>
+        </w:rPr>
+        <w:t xml:space="preserve">A14: </w:t>
+      </w:r>
+      <w:r>
+        <w:rPr>
+          <w:b w:val="false"/>
+          <w:bCs w:val="false"/>
+          <w:color w:val="000000"/>
           <w:sz w:val="22"/>
           <w:szCs w:val="22"/>
         </w:rPr>
@@ -877,23 +1310,23 @@
     </w:p>
     <w:p>
       <w:pPr>
-        <w:spacing w:after="60" w:before="200"/>
-      </w:pPr>
-      <w:r>
-        <w:rPr>
-          <w:b/>
-          <w:bCs/>
-          <w:color w:val="254498"/>
-          <w:sz w:val="22"/>
-          <w:szCs w:val="22"/>
-        </w:rPr>
-        <w:t xml:space="preserve">Q13: </w:t>
-      </w:r>
-      <w:r>
-        <w:rPr>
-          <w:b/>
-          <w:bCs/>
-          <w:color w:val="262626"/>
+        <w:spacing w:after="60" w:before="220"/>
+      </w:pPr>
+      <w:r>
+        <w:rPr>
+          <w:b/>
+          <w:bCs/>
+          <w:color w:val="0061C7"/>
+          <w:sz w:val="22"/>
+          <w:szCs w:val="22"/>
+        </w:rPr>
+        <w:t xml:space="preserve">Q15: </w:t>
+      </w:r>
+      <w:r>
+        <w:rPr>
+          <w:b/>
+          <w:bCs/>
+          <w:color w:val="000000"/>
           <w:sz w:val="22"/>
           <w:szCs w:val="22"/>
         </w:rPr>
@@ -908,15 +1341,17 @@
         <w:rPr>
           <w:b/>
           <w:bCs/>
-          <w:color w:val="254498"/>
-          <w:sz w:val="22"/>
-          <w:szCs w:val="22"/>
-        </w:rPr>
-        <w:t xml:space="preserve">A13: </w:t>
-      </w:r>
-      <w:r>
-        <w:rPr>
-          <w:color w:val="262626"/>
+          <w:color w:val="0061C7"/>
+          <w:sz w:val="22"/>
+          <w:szCs w:val="22"/>
+        </w:rPr>
+        <w:t xml:space="preserve">A15: </w:t>
+      </w:r>
+      <w:r>
+        <w:rPr>
+          <w:b w:val="false"/>
+          <w:bCs w:val="false"/>
+          <w:color w:val="000000"/>
           <w:sz w:val="22"/>
           <w:szCs w:val="22"/>
         </w:rPr>
@@ -925,23 +1360,23 @@
     </w:p>
     <w:p>
       <w:pPr>
-        <w:spacing w:after="60" w:before="200"/>
-      </w:pPr>
-      <w:r>
-        <w:rPr>
-          <w:b/>
-          <w:bCs/>
-          <w:color w:val="254498"/>
-          <w:sz w:val="22"/>
-          <w:szCs w:val="22"/>
-        </w:rPr>
-        <w:t xml:space="preserve">Q14: </w:t>
-      </w:r>
-      <w:r>
-        <w:rPr>
-          <w:b/>
-          <w:bCs/>
-          <w:color w:val="262626"/>
+        <w:spacing w:after="60" w:before="220"/>
+      </w:pPr>
+      <w:r>
+        <w:rPr>
+          <w:b/>
+          <w:bCs/>
+          <w:color w:val="0061C7"/>
+          <w:sz w:val="22"/>
+          <w:szCs w:val="22"/>
+        </w:rPr>
+        <w:t xml:space="preserve">Q16: </w:t>
+      </w:r>
+      <w:r>
+        <w:rPr>
+          <w:b/>
+          <w:bCs/>
+          <w:color w:val="000000"/>
           <w:sz w:val="22"/>
           <w:szCs w:val="22"/>
         </w:rPr>
@@ -956,40 +1391,63 @@
         <w:rPr>
           <w:b/>
           <w:bCs/>
-          <w:color w:val="254498"/>
-          <w:sz w:val="22"/>
-          <w:szCs w:val="22"/>
-        </w:rPr>
-        <w:t xml:space="preserve">A14: </w:t>
-      </w:r>
-      <w:r>
-        <w:rPr>
-          <w:color w:val="262626"/>
-          <w:sz w:val="22"/>
-          <w:szCs w:val="22"/>
-        </w:rPr>
-        <w:t xml:space="preserve">Overseas card usage enabled by SMS is valid for 12 months from the date of activation. To enable overseas usage perpetually instead, replace the keyword “AOT” with “AOTP” in the SMS. An expiry date for overseas usage can be set if the function is enabled through the Standard Chartered Singapore website. Confirmation is sent by SMS once the card or cards have been successfully enabled.</w:t>
-      </w:r>
-    </w:p>
-    <w:p>
-      <w:pPr>
-        <w:spacing w:after="60" w:before="200"/>
-      </w:pPr>
-      <w:r>
-        <w:rPr>
-          <w:b/>
-          <w:bCs/>
-          <w:color w:val="254498"/>
-          <w:sz w:val="22"/>
-          <w:szCs w:val="22"/>
-        </w:rPr>
-        <w:t xml:space="preserve">Q15: </w:t>
-      </w:r>
-      <w:r>
-        <w:rPr>
-          <w:b/>
-          <w:bCs/>
-          <w:color w:val="262626"/>
+          <w:color w:val="0061C7"/>
+          <w:sz w:val="22"/>
+          <w:szCs w:val="22"/>
+        </w:rPr>
+        <w:t xml:space="preserve">A16: </w:t>
+      </w:r>
+      <w:r>
+        <w:rPr>
+          <w:b w:val="false"/>
+          <w:bCs w:val="false"/>
+          <w:color w:val="000000"/>
+          <w:sz w:val="22"/>
+          <w:szCs w:val="22"/>
+        </w:rPr>
+        <w:t xml:space="preserve">Overseas card usage enabled by SMS is valid for 12 months from the date of activation. To enable overseas usage perpetually instead, replace the keyword “AOT” with “AOTP” in the SMS. An expiry date for overseas usage can be set if the function is enabled through the Bank’s online form at </w:t>
+      </w:r>
+      <w:hyperlink w:history="1" r:id="rIdwqzy0co6l6bkjbyyq-avi">
+        <w:r>
+          <w:rPr>
+            <w:color w:val="0061C7"/>
+            <w:sz w:val="22"/>
+            <w:szCs w:val="22"/>
+            <w:u w:val="single"/>
+          </w:rPr>
+          <w:t xml:space="preserve">online.forms.standardchartered.com</w:t>
+        </w:r>
+      </w:hyperlink>
+      <w:r>
+        <w:rPr>
+          <w:b w:val="false"/>
+          <w:bCs w:val="false"/>
+          <w:color w:val="000000"/>
+          <w:sz w:val="22"/>
+          <w:szCs w:val="22"/>
+        </w:rPr>
+        <w:t xml:space="preserve">. Confirmation is sent by SMS once the card or cards have been successfully enabled.</w:t>
+      </w:r>
+    </w:p>
+    <w:p>
+      <w:pPr>
+        <w:spacing w:after="60" w:before="220"/>
+      </w:pPr>
+      <w:r>
+        <w:rPr>
+          <w:b/>
+          <w:bCs/>
+          <w:color w:val="0061C7"/>
+          <w:sz w:val="22"/>
+          <w:szCs w:val="22"/>
+        </w:rPr>
+        <w:t xml:space="preserve">Q17: </w:t>
+      </w:r>
+      <w:r>
+        <w:rPr>
+          <w:b/>
+          <w:bCs/>
+          <w:color w:val="000000"/>
           <w:sz w:val="22"/>
           <w:szCs w:val="22"/>
         </w:rPr>
@@ -1004,15 +1462,17 @@
         <w:rPr>
           <w:b/>
           <w:bCs/>
-          <w:color w:val="254498"/>
-          <w:sz w:val="22"/>
-          <w:szCs w:val="22"/>
-        </w:rPr>
-        <w:t xml:space="preserve">A15: </w:t>
-      </w:r>
-      <w:r>
-        <w:rPr>
-          <w:color w:val="262626"/>
+          <w:color w:val="0061C7"/>
+          <w:sz w:val="22"/>
+          <w:szCs w:val="22"/>
+        </w:rPr>
+        <w:t xml:space="preserve">A17: </w:t>
+      </w:r>
+      <w:r>
+        <w:rPr>
+          <w:b w:val="false"/>
+          <w:bCs w:val="false"/>
+          <w:color w:val="000000"/>
           <w:sz w:val="22"/>
           <w:szCs w:val="22"/>
         </w:rPr>
@@ -1021,23 +1481,23 @@
     </w:p>
     <w:p>
       <w:pPr>
-        <w:spacing w:after="60" w:before="200"/>
-      </w:pPr>
-      <w:r>
-        <w:rPr>
-          <w:b/>
-          <w:bCs/>
-          <w:color w:val="254498"/>
-          <w:sz w:val="22"/>
-          <w:szCs w:val="22"/>
-        </w:rPr>
-        <w:t xml:space="preserve">Q16: </w:t>
-      </w:r>
-      <w:r>
-        <w:rPr>
-          <w:b/>
-          <w:bCs/>
-          <w:color w:val="262626"/>
+        <w:spacing w:after="60" w:before="220"/>
+      </w:pPr>
+      <w:r>
+        <w:rPr>
+          <w:b/>
+          <w:bCs/>
+          <w:color w:val="0061C7"/>
+          <w:sz w:val="22"/>
+          <w:szCs w:val="22"/>
+        </w:rPr>
+        <w:t xml:space="preserve">Q18: </w:t>
+      </w:r>
+      <w:r>
+        <w:rPr>
+          <w:b/>
+          <w:bCs/>
+          <w:color w:val="000000"/>
           <w:sz w:val="22"/>
           <w:szCs w:val="22"/>
         </w:rPr>
@@ -1052,15 +1512,17 @@
         <w:rPr>
           <w:b/>
           <w:bCs/>
-          <w:color w:val="254498"/>
-          <w:sz w:val="22"/>
-          <w:szCs w:val="22"/>
-        </w:rPr>
-        <w:t xml:space="preserve">A16: </w:t>
-      </w:r>
-      <w:r>
-        <w:rPr>
-          <w:color w:val="262626"/>
+          <w:color w:val="0061C7"/>
+          <w:sz w:val="22"/>
+          <w:szCs w:val="22"/>
+        </w:rPr>
+        <w:t xml:space="preserve">A18: </w:t>
+      </w:r>
+      <w:r>
+        <w:rPr>
+          <w:b w:val="false"/>
+          <w:bCs w:val="false"/>
+          <w:color w:val="000000"/>
           <w:sz w:val="22"/>
           <w:szCs w:val="22"/>
         </w:rPr>
@@ -1069,23 +1531,23 @@
     </w:p>
     <w:p>
       <w:pPr>
-        <w:spacing w:after="60" w:before="200"/>
-      </w:pPr>
-      <w:r>
-        <w:rPr>
-          <w:b/>
-          <w:bCs/>
-          <w:color w:val="254498"/>
-          <w:sz w:val="22"/>
-          <w:szCs w:val="22"/>
-        </w:rPr>
-        <w:t xml:space="preserve">Q17: </w:t>
-      </w:r>
-      <w:r>
-        <w:rPr>
-          <w:b/>
-          <w:bCs/>
-          <w:color w:val="262626"/>
+        <w:spacing w:after="60" w:before="220"/>
+      </w:pPr>
+      <w:r>
+        <w:rPr>
+          <w:b/>
+          <w:bCs/>
+          <w:color w:val="0061C7"/>
+          <w:sz w:val="22"/>
+          <w:szCs w:val="22"/>
+        </w:rPr>
+        <w:t xml:space="preserve">Q19: </w:t>
+      </w:r>
+      <w:r>
+        <w:rPr>
+          <w:b/>
+          <w:bCs/>
+          <w:color w:val="000000"/>
           <w:sz w:val="22"/>
           <w:szCs w:val="22"/>
         </w:rPr>
@@ -1100,33 +1562,58 @@
         <w:rPr>
           <w:b/>
           <w:bCs/>
-          <w:color w:val="254498"/>
-          <w:sz w:val="22"/>
-          <w:szCs w:val="22"/>
-        </w:rPr>
-        <w:t xml:space="preserve">A17: </w:t>
-      </w:r>
-      <w:r>
-        <w:rPr>
-          <w:color w:val="262626"/>
-          <w:sz w:val="22"/>
-          <w:szCs w:val="22"/>
-        </w:rPr>
-        <w:t xml:space="preserve">A Standard Chartered card PIN can be set or changed in SC Mobile as follows:</w:t>
-      </w:r>
-    </w:p>
-    <w:p>
-      <w:pPr>
-        <w:pStyle w:val="ListParagraph"/>
-        <w:numPr>
-          <w:ilvl w:val="0"/>
-          <w:numId w:val="2"/>
-        </w:numPr>
-        <w:spacing w:after="20" w:before="20"/>
-      </w:pPr>
-      <w:r>
-        <w:rPr>
-          <w:color w:val="262626"/>
+          <w:color w:val="0061C7"/>
+          <w:sz w:val="22"/>
+          <w:szCs w:val="22"/>
+        </w:rPr>
+        <w:t xml:space="preserve">A19: </w:t>
+      </w:r>
+      <w:r>
+        <w:rPr>
+          <w:b w:val="false"/>
+          <w:bCs w:val="false"/>
+          <w:color w:val="000000"/>
+          <w:sz w:val="22"/>
+          <w:szCs w:val="22"/>
+        </w:rPr>
+        <w:t xml:space="preserve">A Standard Chartered card PIN can be set or changed in </w:t>
+      </w:r>
+      <w:hyperlink w:history="1" r:id="rId0bezsyqiekdsatd-pxx5n">
+        <w:r>
+          <w:rPr>
+            <w:color w:val="0061C7"/>
+            <w:sz w:val="22"/>
+            <w:szCs w:val="22"/>
+            <w:u w:val="single"/>
+          </w:rPr>
+          <w:t xml:space="preserve">SC Mobile</w:t>
+        </w:r>
+      </w:hyperlink>
+      <w:r>
+        <w:rPr>
+          <w:b w:val="false"/>
+          <w:bCs w:val="false"/>
+          <w:color w:val="000000"/>
+          <w:sz w:val="22"/>
+          <w:szCs w:val="22"/>
+        </w:rPr>
+        <w:t xml:space="preserve"> as follows:</w:t>
+      </w:r>
+    </w:p>
+    <w:p>
+      <w:pPr>
+        <w:pStyle w:val="ListParagraph"/>
+        <w:numPr>
+          <w:ilvl w:val="0"/>
+          <w:numId w:val="2"/>
+        </w:numPr>
+        <w:spacing w:after="20" w:before="20"/>
+      </w:pPr>
+      <w:r>
+        <w:rPr>
+          <w:b w:val="false"/>
+          <w:bCs w:val="false"/>
+          <w:color w:val="000000"/>
           <w:sz w:val="22"/>
           <w:szCs w:val="22"/>
         </w:rPr>
@@ -1144,7 +1631,9 @@
       </w:pPr>
       <w:r>
         <w:rPr>
-          <w:color w:val="262626"/>
+          <w:b w:val="false"/>
+          <w:bCs w:val="false"/>
+          <w:color w:val="000000"/>
           <w:sz w:val="22"/>
           <w:szCs w:val="22"/>
         </w:rPr>
@@ -1162,7 +1651,9 @@
       </w:pPr>
       <w:r>
         <w:rPr>
-          <w:color w:val="262626"/>
+          <w:b w:val="false"/>
+          <w:bCs w:val="false"/>
+          <w:color w:val="000000"/>
           <w:sz w:val="22"/>
           <w:szCs w:val="22"/>
         </w:rPr>
@@ -1180,7 +1671,9 @@
       </w:pPr>
       <w:r>
         <w:rPr>
-          <w:color w:val="262626"/>
+          <w:b w:val="false"/>
+          <w:bCs w:val="false"/>
+          <w:color w:val="000000"/>
           <w:sz w:val="22"/>
           <w:szCs w:val="22"/>
         </w:rPr>
@@ -1189,23 +1682,23 @@
     </w:p>
     <w:p>
       <w:pPr>
-        <w:spacing w:after="60" w:before="200"/>
-      </w:pPr>
-      <w:r>
-        <w:rPr>
-          <w:b/>
-          <w:bCs/>
-          <w:color w:val="254498"/>
-          <w:sz w:val="22"/>
-          <w:szCs w:val="22"/>
-        </w:rPr>
-        <w:t xml:space="preserve">Q18: </w:t>
-      </w:r>
-      <w:r>
-        <w:rPr>
-          <w:b/>
-          <w:bCs/>
-          <w:color w:val="262626"/>
+        <w:spacing w:after="60" w:before="220"/>
+      </w:pPr>
+      <w:r>
+        <w:rPr>
+          <w:b/>
+          <w:bCs/>
+          <w:color w:val="0061C7"/>
+          <w:sz w:val="22"/>
+          <w:szCs w:val="22"/>
+        </w:rPr>
+        <w:t xml:space="preserve">Q20: </w:t>
+      </w:r>
+      <w:r>
+        <w:rPr>
+          <w:b/>
+          <w:bCs/>
+          <w:color w:val="000000"/>
           <w:sz w:val="22"/>
           <w:szCs w:val="22"/>
         </w:rPr>
@@ -1220,15 +1713,17 @@
         <w:rPr>
           <w:b/>
           <w:bCs/>
-          <w:color w:val="254498"/>
-          <w:sz w:val="22"/>
-          <w:szCs w:val="22"/>
-        </w:rPr>
-        <w:t xml:space="preserve">A18: </w:t>
-      </w:r>
-      <w:r>
-        <w:rPr>
-          <w:color w:val="262626"/>
+          <w:color w:val="0061C7"/>
+          <w:sz w:val="22"/>
+          <w:szCs w:val="22"/>
+        </w:rPr>
+        <w:t xml:space="preserve">A20: </w:t>
+      </w:r>
+      <w:r>
+        <w:rPr>
+          <w:b w:val="false"/>
+          <w:bCs w:val="false"/>
+          <w:color w:val="000000"/>
           <w:sz w:val="22"/>
           <w:szCs w:val="22"/>
         </w:rPr>
@@ -1246,7 +1741,9 @@
       </w:pPr>
       <w:r>
         <w:rPr>
-          <w:color w:val="262626"/>
+          <w:b w:val="false"/>
+          <w:bCs w:val="false"/>
+          <w:color w:val="000000"/>
           <w:sz w:val="22"/>
           <w:szCs w:val="22"/>
         </w:rPr>
@@ -1264,7 +1761,9 @@
       </w:pPr>
       <w:r>
         <w:rPr>
-          <w:color w:val="262626"/>
+          <w:b w:val="false"/>
+          <w:bCs w:val="false"/>
+          <w:color w:val="000000"/>
           <w:sz w:val="22"/>
           <w:szCs w:val="22"/>
         </w:rPr>
@@ -1282,7 +1781,9 @@
       </w:pPr>
       <w:r>
         <w:rPr>
-          <w:color w:val="262626"/>
+          <w:b w:val="false"/>
+          <w:bCs w:val="false"/>
+          <w:color w:val="000000"/>
           <w:sz w:val="22"/>
           <w:szCs w:val="22"/>
         </w:rPr>
@@ -1300,7 +1801,9 @@
       </w:pPr>
       <w:r>
         <w:rPr>
-          <w:color w:val="262626"/>
+          <w:b w:val="false"/>
+          <w:bCs w:val="false"/>
+          <w:color w:val="000000"/>
           <w:sz w:val="22"/>
           <w:szCs w:val="22"/>
         </w:rPr>
@@ -1318,7 +1821,9 @@
       </w:pPr>
       <w:r>
         <w:rPr>
-          <w:color w:val="262626"/>
+          <w:b w:val="false"/>
+          <w:bCs w:val="false"/>
+          <w:color w:val="000000"/>
           <w:sz w:val="22"/>
           <w:szCs w:val="22"/>
         </w:rPr>
@@ -1327,56 +1832,81 @@
     </w:p>
     <w:p>
       <w:pPr>
-        <w:pStyle w:val="Heading2"/>
-        <w:shd w:fill="D8DDED" w:color="auto" w:val="clear"/>
-        <w:spacing w:after="0" w:before="300" w:line="300"/>
-      </w:pPr>
-      <w:r>
-        <w:rPr>
-          <w:b/>
-          <w:bCs/>
-          <w:color w:val="254498"/>
-          <w:sz w:val="26"/>
-          <w:szCs w:val="26"/>
-        </w:rPr>
-        <w:t xml:space="preserve">Help › Lost Card</w:t>
-      </w:r>
-    </w:p>
-    <w:p>
-      <w:pPr>
-        <w:shd w:fill="D8DDED" w:color="auto" w:val="clear"/>
+        <w:pStyle w:val="Heading3"/>
+        <w:pBdr>
+          <w:top w:val="single" w:color="0061C7" w:sz="8" w:space="6"/>
+          <w:left w:val="single" w:color="0061C7" w:sz="8" w:space="6"/>
+          <w:right w:val="single" w:color="0061C7" w:sz="8" w:space="6"/>
+        </w:pBdr>
+        <w:shd w:fill="D9E7F7" w:color="auto" w:val="clear"/>
+        <w:spacing w:after="0" w:before="240" w:line="300"/>
+        <w:ind w:left="160" w:right="160"/>
+      </w:pPr>
+      <w:r>
+        <w:rPr>
+          <w:b/>
+          <w:bCs/>
+          <w:color w:val="2C3A87"/>
+          <w:sz w:val="24"/>
+          <w:szCs w:val="24"/>
+        </w:rPr>
+        <w:t xml:space="preserve">Card Services › Lost Card</w:t>
+      </w:r>
+    </w:p>
+    <w:p>
+      <w:pPr>
+        <w:pBdr>
+          <w:bottom w:val="single" w:color="0061C7" w:sz="8" w:space="6"/>
+          <w:left w:val="single" w:color="0061C7" w:sz="8" w:space="6"/>
+          <w:right w:val="single" w:color="0061C7" w:sz="8" w:space="6"/>
+        </w:pBdr>
+        <w:shd w:fill="D9E7F7" w:color="auto" w:val="clear"/>
         <w:spacing w:after="200" w:before="0" w:line="260"/>
+        <w:ind w:left="160" w:right="160"/>
       </w:pPr>
       <w:r>
         <w:rPr>
           <w:i/>
           <w:iCs/>
-          <w:color w:val="254498"/>
+          <w:color w:val="2C3A87"/>
           <w:sz w:val="18"/>
           <w:szCs w:val="18"/>
         </w:rPr>
-        <w:t xml:space="preserve">Source: https://www.sc.com/sg/help/lost-card/</w:t>
-      </w:r>
-    </w:p>
-    <w:p>
-      <w:pPr>
-        <w:spacing w:after="60" w:before="200"/>
-      </w:pPr>
-      <w:r>
-        <w:rPr>
-          <w:b/>
-          <w:bCs/>
-          <w:color w:val="254498"/>
-          <w:sz w:val="22"/>
-          <w:szCs w:val="22"/>
-        </w:rPr>
-        <w:t xml:space="preserve">Q1: </w:t>
-      </w:r>
-      <w:r>
-        <w:rPr>
-          <w:b/>
-          <w:bCs/>
-          <w:color w:val="262626"/>
+        <w:t xml:space="preserve">Source: </w:t>
+      </w:r>
+      <w:hyperlink w:history="1" r:id="rIdlpnhib7mf3svb1xwdvc1b">
+        <w:r>
+          <w:rPr>
+            <w:i/>
+            <w:iCs/>
+            <w:color w:val="0061C7"/>
+            <w:sz w:val="18"/>
+            <w:szCs w:val="18"/>
+            <w:u w:val="single"/>
+          </w:rPr>
+          <w:t xml:space="preserve">https://www.sc.com/sg/help/lost-card/</w:t>
+        </w:r>
+      </w:hyperlink>
+    </w:p>
+    <w:p>
+      <w:pPr>
+        <w:spacing w:after="60" w:before="220"/>
+      </w:pPr>
+      <w:r>
+        <w:rPr>
+          <w:b/>
+          <w:bCs/>
+          <w:color w:val="0061C7"/>
+          <w:sz w:val="22"/>
+          <w:szCs w:val="22"/>
+        </w:rPr>
+        <w:t xml:space="preserve">Q21: </w:t>
+      </w:r>
+      <w:r>
+        <w:rPr>
+          <w:b/>
+          <w:bCs/>
+          <w:color w:val="000000"/>
           <w:sz w:val="22"/>
           <w:szCs w:val="22"/>
         </w:rPr>
@@ -1391,40 +1921,84 @@
         <w:rPr>
           <w:b/>
           <w:bCs/>
-          <w:color w:val="254498"/>
-          <w:sz w:val="22"/>
-          <w:szCs w:val="22"/>
-        </w:rPr>
-        <w:t xml:space="preserve">A1: </w:t>
-      </w:r>
-      <w:r>
-        <w:rPr>
-          <w:color w:val="262626"/>
-          <w:sz w:val="22"/>
-          <w:szCs w:val="22"/>
-        </w:rPr>
-        <w:t xml:space="preserve">A Standard Chartered card should be reported if it is lost or stolen, or if its PIN has been disclosed to a third person. The report can be made by logging in to Online Banking or SC Mobile.</w:t>
-      </w:r>
-    </w:p>
-    <w:p>
-      <w:pPr>
-        <w:spacing w:after="60" w:before="200"/>
-      </w:pPr>
-      <w:r>
-        <w:rPr>
-          <w:b/>
-          <w:bCs/>
-          <w:color w:val="254498"/>
-          <w:sz w:val="22"/>
-          <w:szCs w:val="22"/>
-        </w:rPr>
-        <w:t xml:space="preserve">Q2: </w:t>
-      </w:r>
-      <w:r>
-        <w:rPr>
-          <w:b/>
-          <w:bCs/>
-          <w:color w:val="262626"/>
+          <w:color w:val="0061C7"/>
+          <w:sz w:val="22"/>
+          <w:szCs w:val="22"/>
+        </w:rPr>
+        <w:t xml:space="preserve">A21: </w:t>
+      </w:r>
+      <w:r>
+        <w:rPr>
+          <w:b w:val="false"/>
+          <w:bCs w:val="false"/>
+          <w:color w:val="000000"/>
+          <w:sz w:val="22"/>
+          <w:szCs w:val="22"/>
+        </w:rPr>
+        <w:t xml:space="preserve">A Standard Chartered card should be reported if it is lost or stolen, or if its PIN has been disclosed to a third person. The report can be made by logging in to </w:t>
+      </w:r>
+      <w:hyperlink w:history="1" r:id="rIdgrs1ftnqsn0fsypj923er">
+        <w:r>
+          <w:rPr>
+            <w:color w:val="0061C7"/>
+            <w:sz w:val="22"/>
+            <w:szCs w:val="22"/>
+            <w:u w:val="single"/>
+          </w:rPr>
+          <w:t xml:space="preserve">Online Banking</w:t>
+        </w:r>
+      </w:hyperlink>
+      <w:r>
+        <w:rPr>
+          <w:b w:val="false"/>
+          <w:bCs w:val="false"/>
+          <w:color w:val="000000"/>
+          <w:sz w:val="22"/>
+          <w:szCs w:val="22"/>
+        </w:rPr>
+        <w:t xml:space="preserve"> or </w:t>
+      </w:r>
+      <w:hyperlink w:history="1" r:id="rIdolicaaq-h85vaxu78mclo">
+        <w:r>
+          <w:rPr>
+            <w:color w:val="0061C7"/>
+            <w:sz w:val="22"/>
+            <w:szCs w:val="22"/>
+            <w:u w:val="single"/>
+          </w:rPr>
+          <w:t xml:space="preserve">SC Mobile</w:t>
+        </w:r>
+      </w:hyperlink>
+      <w:r>
+        <w:rPr>
+          <w:b w:val="false"/>
+          <w:bCs w:val="false"/>
+          <w:color w:val="000000"/>
+          <w:sz w:val="22"/>
+          <w:szCs w:val="22"/>
+        </w:rPr>
+        <w:t xml:space="preserve">.</w:t>
+      </w:r>
+    </w:p>
+    <w:p>
+      <w:pPr>
+        <w:spacing w:after="60" w:before="220"/>
+      </w:pPr>
+      <w:r>
+        <w:rPr>
+          <w:b/>
+          <w:bCs/>
+          <w:color w:val="0061C7"/>
+          <w:sz w:val="22"/>
+          <w:szCs w:val="22"/>
+        </w:rPr>
+        <w:t xml:space="preserve">Q22: </w:t>
+      </w:r>
+      <w:r>
+        <w:rPr>
+          <w:b/>
+          <w:bCs/>
+          <w:color w:val="000000"/>
           <w:sz w:val="22"/>
           <w:szCs w:val="22"/>
         </w:rPr>
@@ -1439,33 +2013,79 @@
         <w:rPr>
           <w:b/>
           <w:bCs/>
-          <w:color w:val="254498"/>
-          <w:sz w:val="22"/>
-          <w:szCs w:val="22"/>
-        </w:rPr>
-        <w:t xml:space="preserve">A2: </w:t>
-      </w:r>
-      <w:r>
-        <w:rPr>
-          <w:color w:val="262626"/>
-          <w:sz w:val="22"/>
-          <w:szCs w:val="22"/>
-        </w:rPr>
-        <w:t xml:space="preserve">A lost or stolen Standard Chartered card is reported as follows:</w:t>
-      </w:r>
-    </w:p>
-    <w:p>
-      <w:pPr>
-        <w:pStyle w:val="ListParagraph"/>
-        <w:numPr>
-          <w:ilvl w:val="0"/>
-          <w:numId w:val="2"/>
-        </w:numPr>
-        <w:spacing w:after="20" w:before="20"/>
-      </w:pPr>
-      <w:r>
-        <w:rPr>
-          <w:color w:val="262626"/>
+          <w:color w:val="0061C7"/>
+          <w:sz w:val="22"/>
+          <w:szCs w:val="22"/>
+        </w:rPr>
+        <w:t xml:space="preserve">A22: </w:t>
+      </w:r>
+      <w:r>
+        <w:rPr>
+          <w:b w:val="false"/>
+          <w:bCs w:val="false"/>
+          <w:color w:val="000000"/>
+          <w:sz w:val="22"/>
+          <w:szCs w:val="22"/>
+        </w:rPr>
+        <w:t xml:space="preserve">A lost or stolen Standard Chartered card is reported through </w:t>
+      </w:r>
+      <w:hyperlink w:history="1" r:id="rIdmrvrvmx7hw5o-3ogh6oq5">
+        <w:r>
+          <w:rPr>
+            <w:color w:val="0061C7"/>
+            <w:sz w:val="22"/>
+            <w:szCs w:val="22"/>
+            <w:u w:val="single"/>
+          </w:rPr>
+          <w:t xml:space="preserve">Online Banking</w:t>
+        </w:r>
+      </w:hyperlink>
+      <w:r>
+        <w:rPr>
+          <w:b w:val="false"/>
+          <w:bCs w:val="false"/>
+          <w:color w:val="000000"/>
+          <w:sz w:val="22"/>
+          <w:szCs w:val="22"/>
+        </w:rPr>
+        <w:t xml:space="preserve"> or </w:t>
+      </w:r>
+      <w:hyperlink w:history="1" r:id="rIdsedldjhwuabfgvcvx2ig0">
+        <w:r>
+          <w:rPr>
+            <w:color w:val="0061C7"/>
+            <w:sz w:val="22"/>
+            <w:szCs w:val="22"/>
+            <w:u w:val="single"/>
+          </w:rPr>
+          <w:t xml:space="preserve">SC Mobile</w:t>
+        </w:r>
+      </w:hyperlink>
+      <w:r>
+        <w:rPr>
+          <w:b w:val="false"/>
+          <w:bCs w:val="false"/>
+          <w:color w:val="000000"/>
+          <w:sz w:val="22"/>
+          <w:szCs w:val="22"/>
+        </w:rPr>
+        <w:t xml:space="preserve"> as follows:</w:t>
+      </w:r>
+    </w:p>
+    <w:p>
+      <w:pPr>
+        <w:pStyle w:val="ListParagraph"/>
+        <w:numPr>
+          <w:ilvl w:val="0"/>
+          <w:numId w:val="2"/>
+        </w:numPr>
+        <w:spacing w:after="20" w:before="20"/>
+      </w:pPr>
+      <w:r>
+        <w:rPr>
+          <w:b w:val="false"/>
+          <w:bCs w:val="false"/>
+          <w:color w:val="000000"/>
           <w:sz w:val="22"/>
           <w:szCs w:val="22"/>
         </w:rPr>
@@ -1483,7 +2103,9 @@
       </w:pPr>
       <w:r>
         <w:rPr>
-          <w:color w:val="262626"/>
+          <w:b w:val="false"/>
+          <w:bCs w:val="false"/>
+          <w:color w:val="000000"/>
           <w:sz w:val="22"/>
           <w:szCs w:val="22"/>
         </w:rPr>
@@ -1501,7 +2123,9 @@
       </w:pPr>
       <w:r>
         <w:rPr>
-          <w:color w:val="262626"/>
+          <w:b w:val="false"/>
+          <w:bCs w:val="false"/>
+          <w:color w:val="000000"/>
           <w:sz w:val="22"/>
           <w:szCs w:val="22"/>
         </w:rPr>
@@ -1519,7 +2143,9 @@
       </w:pPr>
       <w:r>
         <w:rPr>
-          <w:color w:val="262626"/>
+          <w:b w:val="false"/>
+          <w:bCs w:val="false"/>
+          <w:color w:val="000000"/>
           <w:sz w:val="22"/>
           <w:szCs w:val="22"/>
         </w:rPr>
@@ -1537,7 +2163,9 @@
       </w:pPr>
       <w:r>
         <w:rPr>
-          <w:color w:val="262626"/>
+          <w:b w:val="false"/>
+          <w:bCs w:val="false"/>
+          <w:color w:val="000000"/>
           <w:sz w:val="22"/>
           <w:szCs w:val="22"/>
         </w:rPr>
@@ -1546,23 +2174,23 @@
     </w:p>
     <w:p>
       <w:pPr>
-        <w:spacing w:after="60" w:before="200"/>
-      </w:pPr>
-      <w:r>
-        <w:rPr>
-          <w:b/>
-          <w:bCs/>
-          <w:color w:val="254498"/>
-          <w:sz w:val="22"/>
-          <w:szCs w:val="22"/>
-        </w:rPr>
-        <w:t xml:space="preserve">Q3: </w:t>
-      </w:r>
-      <w:r>
-        <w:rPr>
-          <w:b/>
-          <w:bCs/>
-          <w:color w:val="262626"/>
+        <w:spacing w:after="60" w:before="220"/>
+      </w:pPr>
+      <w:r>
+        <w:rPr>
+          <w:b/>
+          <w:bCs/>
+          <w:color w:val="0061C7"/>
+          <w:sz w:val="22"/>
+          <w:szCs w:val="22"/>
+        </w:rPr>
+        <w:t xml:space="preserve">Q23: </w:t>
+      </w:r>
+      <w:r>
+        <w:rPr>
+          <w:b/>
+          <w:bCs/>
+          <w:color w:val="000000"/>
           <w:sz w:val="22"/>
           <w:szCs w:val="22"/>
         </w:rPr>
@@ -1577,15 +2205,17 @@
         <w:rPr>
           <w:b/>
           <w:bCs/>
-          <w:color w:val="254498"/>
-          <w:sz w:val="22"/>
-          <w:szCs w:val="22"/>
-        </w:rPr>
-        <w:t xml:space="preserve">A3: </w:t>
-      </w:r>
-      <w:r>
-        <w:rPr>
-          <w:color w:val="262626"/>
+          <w:color w:val="0061C7"/>
+          <w:sz w:val="22"/>
+          <w:szCs w:val="22"/>
+        </w:rPr>
+        <w:t xml:space="preserve">A23: </w:t>
+      </w:r>
+      <w:r>
+        <w:rPr>
+          <w:b w:val="false"/>
+          <w:bCs w:val="false"/>
+          <w:color w:val="000000"/>
           <w:sz w:val="22"/>
           <w:szCs w:val="22"/>
         </w:rPr>
@@ -1594,23 +2224,23 @@
     </w:p>
     <w:p>
       <w:pPr>
-        <w:spacing w:after="60" w:before="200"/>
-      </w:pPr>
-      <w:r>
-        <w:rPr>
-          <w:b/>
-          <w:bCs/>
-          <w:color w:val="254498"/>
-          <w:sz w:val="22"/>
-          <w:szCs w:val="22"/>
-        </w:rPr>
-        <w:t xml:space="preserve">Q4: </w:t>
-      </w:r>
-      <w:r>
-        <w:rPr>
-          <w:b/>
-          <w:bCs/>
-          <w:color w:val="262626"/>
+        <w:spacing w:after="60" w:before="220"/>
+      </w:pPr>
+      <w:r>
+        <w:rPr>
+          <w:b/>
+          <w:bCs/>
+          <w:color w:val="0061C7"/>
+          <w:sz w:val="22"/>
+          <w:szCs w:val="22"/>
+        </w:rPr>
+        <w:t xml:space="preserve">Q24: </w:t>
+      </w:r>
+      <w:r>
+        <w:rPr>
+          <w:b/>
+          <w:bCs/>
+          <w:color w:val="000000"/>
           <w:sz w:val="22"/>
           <w:szCs w:val="22"/>
         </w:rPr>
@@ -1625,33 +2255,79 @@
         <w:rPr>
           <w:b/>
           <w:bCs/>
-          <w:color w:val="254498"/>
-          <w:sz w:val="22"/>
-          <w:szCs w:val="22"/>
-        </w:rPr>
-        <w:t xml:space="preserve">A4: </w:t>
-      </w:r>
-      <w:r>
-        <w:rPr>
-          <w:color w:val="262626"/>
-          <w:sz w:val="22"/>
-          <w:szCs w:val="22"/>
-        </w:rPr>
-        <w:t xml:space="preserve">A Standard Chartered credit or debit/ATM card PIN is reset as follows:</w:t>
-      </w:r>
-    </w:p>
-    <w:p>
-      <w:pPr>
-        <w:pStyle w:val="ListParagraph"/>
-        <w:numPr>
-          <w:ilvl w:val="0"/>
-          <w:numId w:val="2"/>
-        </w:numPr>
-        <w:spacing w:after="20" w:before="20"/>
-      </w:pPr>
-      <w:r>
-        <w:rPr>
-          <w:color w:val="262626"/>
+          <w:color w:val="0061C7"/>
+          <w:sz w:val="22"/>
+          <w:szCs w:val="22"/>
+        </w:rPr>
+        <w:t xml:space="preserve">A24: </w:t>
+      </w:r>
+      <w:r>
+        <w:rPr>
+          <w:b w:val="false"/>
+          <w:bCs w:val="false"/>
+          <w:color w:val="000000"/>
+          <w:sz w:val="22"/>
+          <w:szCs w:val="22"/>
+        </w:rPr>
+        <w:t xml:space="preserve">A Standard Chartered credit or debit/ATM card PIN is reset through </w:t>
+      </w:r>
+      <w:hyperlink w:history="1" r:id="rIdkr10-gj2eewegn3kgu58v">
+        <w:r>
+          <w:rPr>
+            <w:color w:val="0061C7"/>
+            <w:sz w:val="22"/>
+            <w:szCs w:val="22"/>
+            <w:u w:val="single"/>
+          </w:rPr>
+          <w:t xml:space="preserve">Online Banking</w:t>
+        </w:r>
+      </w:hyperlink>
+      <w:r>
+        <w:rPr>
+          <w:b w:val="false"/>
+          <w:bCs w:val="false"/>
+          <w:color w:val="000000"/>
+          <w:sz w:val="22"/>
+          <w:szCs w:val="22"/>
+        </w:rPr>
+        <w:t xml:space="preserve"> or </w:t>
+      </w:r>
+      <w:hyperlink w:history="1" r:id="rIdxg7ur9br8ukhfxgr4blou">
+        <w:r>
+          <w:rPr>
+            <w:color w:val="0061C7"/>
+            <w:sz w:val="22"/>
+            <w:szCs w:val="22"/>
+            <w:u w:val="single"/>
+          </w:rPr>
+          <w:t xml:space="preserve">SC Mobile</w:t>
+        </w:r>
+      </w:hyperlink>
+      <w:r>
+        <w:rPr>
+          <w:b w:val="false"/>
+          <w:bCs w:val="false"/>
+          <w:color w:val="000000"/>
+          <w:sz w:val="22"/>
+          <w:szCs w:val="22"/>
+        </w:rPr>
+        <w:t xml:space="preserve"> as follows:</w:t>
+      </w:r>
+    </w:p>
+    <w:p>
+      <w:pPr>
+        <w:pStyle w:val="ListParagraph"/>
+        <w:numPr>
+          <w:ilvl w:val="0"/>
+          <w:numId w:val="2"/>
+        </w:numPr>
+        <w:spacing w:after="20" w:before="20"/>
+      </w:pPr>
+      <w:r>
+        <w:rPr>
+          <w:b w:val="false"/>
+          <w:bCs w:val="false"/>
+          <w:color w:val="000000"/>
           <w:sz w:val="22"/>
           <w:szCs w:val="22"/>
         </w:rPr>
@@ -1669,7 +2345,9 @@
       </w:pPr>
       <w:r>
         <w:rPr>
-          <w:color w:val="262626"/>
+          <w:b w:val="false"/>
+          <w:bCs w:val="false"/>
+          <w:color w:val="000000"/>
           <w:sz w:val="22"/>
           <w:szCs w:val="22"/>
         </w:rPr>
@@ -1687,7 +2365,9 @@
       </w:pPr>
       <w:r>
         <w:rPr>
-          <w:color w:val="262626"/>
+          <w:b w:val="false"/>
+          <w:bCs w:val="false"/>
+          <w:color w:val="000000"/>
           <w:sz w:val="22"/>
           <w:szCs w:val="22"/>
         </w:rPr>
@@ -1705,7 +2385,9 @@
       </w:pPr>
       <w:r>
         <w:rPr>
-          <w:color w:val="262626"/>
+          <w:b w:val="false"/>
+          <w:bCs w:val="false"/>
+          <w:color w:val="000000"/>
           <w:sz w:val="22"/>
           <w:szCs w:val="22"/>
         </w:rPr>
@@ -1723,7 +2405,9 @@
       </w:pPr>
       <w:r>
         <w:rPr>
-          <w:color w:val="262626"/>
+          <w:b w:val="false"/>
+          <w:bCs w:val="false"/>
+          <w:color w:val="000000"/>
           <w:sz w:val="22"/>
           <w:szCs w:val="22"/>
         </w:rPr>
@@ -1732,23 +2416,23 @@
     </w:p>
     <w:p>
       <w:pPr>
-        <w:spacing w:after="60" w:before="200"/>
-      </w:pPr>
-      <w:r>
-        <w:rPr>
-          <w:b/>
-          <w:bCs/>
-          <w:color w:val="254498"/>
-          <w:sz w:val="22"/>
-          <w:szCs w:val="22"/>
-        </w:rPr>
-        <w:t xml:space="preserve">Q5: </w:t>
-      </w:r>
-      <w:r>
-        <w:rPr>
-          <w:b/>
-          <w:bCs/>
-          <w:color w:val="262626"/>
+        <w:spacing w:after="60" w:before="220"/>
+      </w:pPr>
+      <w:r>
+        <w:rPr>
+          <w:b/>
+          <w:bCs/>
+          <w:color w:val="0061C7"/>
+          <w:sz w:val="22"/>
+          <w:szCs w:val="22"/>
+        </w:rPr>
+        <w:t xml:space="preserve">Q25: </w:t>
+      </w:r>
+      <w:r>
+        <w:rPr>
+          <w:b/>
+          <w:bCs/>
+          <w:color w:val="000000"/>
           <w:sz w:val="22"/>
           <w:szCs w:val="22"/>
         </w:rPr>
@@ -1763,15 +2447,17 @@
         <w:rPr>
           <w:b/>
           <w:bCs/>
-          <w:color w:val="254498"/>
-          <w:sz w:val="22"/>
-          <w:szCs w:val="22"/>
-        </w:rPr>
-        <w:t xml:space="preserve">A5: </w:t>
-      </w:r>
-      <w:r>
-        <w:rPr>
-          <w:color w:val="262626"/>
+          <w:color w:val="0061C7"/>
+          <w:sz w:val="22"/>
+          <w:szCs w:val="22"/>
+        </w:rPr>
+        <w:t xml:space="preserve">A25: </w:t>
+      </w:r>
+      <w:r>
+        <w:rPr>
+          <w:b w:val="false"/>
+          <w:bCs w:val="false"/>
+          <w:color w:val="000000"/>
           <w:sz w:val="22"/>
           <w:szCs w:val="22"/>
         </w:rPr>
@@ -1781,55 +2467,98 @@
     <w:p>
       <w:pPr>
         <w:pStyle w:val="Heading2"/>
-        <w:shd w:fill="D8DDED" w:color="auto" w:val="clear"/>
-        <w:spacing w:after="0" w:before="300" w:line="300"/>
-      </w:pPr>
-      <w:r>
-        <w:rPr>
-          <w:b/>
-          <w:bCs/>
-          <w:color w:val="254498"/>
-          <w:sz w:val="26"/>
-          <w:szCs w:val="26"/>
-        </w:rPr>
-        <w:t xml:space="preserve">Help › Auto-Financing</w:t>
-      </w:r>
-    </w:p>
-    <w:p>
-      <w:pPr>
-        <w:shd w:fill="D8DDED" w:color="auto" w:val="clear"/>
+        <w:shd w:fill="2C3A87" w:color="auto" w:val="clear"/>
+        <w:spacing w:after="180" w:before="360" w:line="320"/>
+        <w:ind w:left="160" w:right="160"/>
+      </w:pPr>
+      <w:r>
+        <w:rPr>
+          <w:b/>
+          <w:bCs/>
+          <w:color w:val="FFFFFF"/>
+          <w:sz w:val="28"/>
+          <w:szCs w:val="28"/>
+        </w:rPr>
+        <w:t xml:space="preserve">Auto Financing</w:t>
+      </w:r>
+    </w:p>
+    <w:p>
+      <w:pPr>
+        <w:pStyle w:val="Heading3"/>
+        <w:pBdr>
+          <w:top w:val="single" w:color="0061C7" w:sz="8" w:space="6"/>
+          <w:left w:val="single" w:color="0061C7" w:sz="8" w:space="6"/>
+          <w:right w:val="single" w:color="0061C7" w:sz="8" w:space="6"/>
+        </w:pBdr>
+        <w:shd w:fill="D9E7F7" w:color="auto" w:val="clear"/>
+        <w:spacing w:after="0" w:before="240" w:line="300"/>
+        <w:ind w:left="160" w:right="160"/>
+      </w:pPr>
+      <w:r>
+        <w:rPr>
+          <w:b/>
+          <w:bCs/>
+          <w:color w:val="2C3A87"/>
+          <w:sz w:val="24"/>
+          <w:szCs w:val="24"/>
+        </w:rPr>
+        <w:t xml:space="preserve">Auto Financing › Interest Computation and Fees &amp; Charges</w:t>
+      </w:r>
+    </w:p>
+    <w:p>
+      <w:pPr>
+        <w:pBdr>
+          <w:bottom w:val="single" w:color="0061C7" w:sz="8" w:space="6"/>
+          <w:left w:val="single" w:color="0061C7" w:sz="8" w:space="6"/>
+          <w:right w:val="single" w:color="0061C7" w:sz="8" w:space="6"/>
+        </w:pBdr>
+        <w:shd w:fill="D9E7F7" w:color="auto" w:val="clear"/>
         <w:spacing w:after="200" w:before="0" w:line="260"/>
+        <w:ind w:left="160" w:right="160"/>
       </w:pPr>
       <w:r>
         <w:rPr>
           <w:i/>
           <w:iCs/>
-          <w:color w:val="254498"/>
+          <w:color w:val="2C3A87"/>
           <w:sz w:val="18"/>
           <w:szCs w:val="18"/>
         </w:rPr>
-        <w:t xml:space="preserve">Source: https://www.sc.com/sg/help/auto-financing/</w:t>
-      </w:r>
-    </w:p>
-    <w:p>
-      <w:pPr>
-        <w:spacing w:after="60" w:before="200"/>
-      </w:pPr>
-      <w:r>
-        <w:rPr>
-          <w:b/>
-          <w:bCs/>
-          <w:color w:val="254498"/>
-          <w:sz w:val="22"/>
-          <w:szCs w:val="22"/>
-        </w:rPr>
-        <w:t xml:space="preserve">Q1: </w:t>
-      </w:r>
-      <w:r>
-        <w:rPr>
-          <w:b/>
-          <w:bCs/>
-          <w:color w:val="262626"/>
+        <w:t xml:space="preserve">Source: </w:t>
+      </w:r>
+      <w:hyperlink w:history="1" r:id="rIdxznwbduukhgushqpphx2w">
+        <w:r>
+          <w:rPr>
+            <w:i/>
+            <w:iCs/>
+            <w:color w:val="0061C7"/>
+            <w:sz w:val="18"/>
+            <w:szCs w:val="18"/>
+            <w:u w:val="single"/>
+          </w:rPr>
+          <w:t xml:space="preserve">https://www.sc.com/sg/help/auto-financing/</w:t>
+        </w:r>
+      </w:hyperlink>
+    </w:p>
+    <w:p>
+      <w:pPr>
+        <w:spacing w:after="60" w:before="220"/>
+      </w:pPr>
+      <w:r>
+        <w:rPr>
+          <w:b/>
+          <w:bCs/>
+          <w:color w:val="0061C7"/>
+          <w:sz w:val="22"/>
+          <w:szCs w:val="22"/>
+        </w:rPr>
+        <w:t xml:space="preserve">Q26: </w:t>
+      </w:r>
+      <w:r>
+        <w:rPr>
+          <w:b/>
+          <w:bCs/>
+          <w:color w:val="000000"/>
           <w:sz w:val="22"/>
           <w:szCs w:val="22"/>
         </w:rPr>
@@ -1844,15 +2573,17 @@
         <w:rPr>
           <w:b/>
           <w:bCs/>
-          <w:color w:val="254498"/>
-          <w:sz w:val="22"/>
-          <w:szCs w:val="22"/>
-        </w:rPr>
-        <w:t xml:space="preserve">A1: </w:t>
-      </w:r>
-      <w:r>
-        <w:rPr>
-          <w:color w:val="262626"/>
+          <w:color w:val="0061C7"/>
+          <w:sz w:val="22"/>
+          <w:szCs w:val="22"/>
+        </w:rPr>
+        <w:t xml:space="preserve">A26: </w:t>
+      </w:r>
+      <w:r>
+        <w:rPr>
+          <w:b w:val="false"/>
+          <w:bCs w:val="false"/>
+          <w:color w:val="000000"/>
           <w:sz w:val="22"/>
           <w:szCs w:val="22"/>
         </w:rPr>
@@ -1861,23 +2592,23 @@
     </w:p>
     <w:p>
       <w:pPr>
-        <w:spacing w:after="60" w:before="200"/>
-      </w:pPr>
-      <w:r>
-        <w:rPr>
-          <w:b/>
-          <w:bCs/>
-          <w:color w:val="254498"/>
-          <w:sz w:val="22"/>
-          <w:szCs w:val="22"/>
-        </w:rPr>
-        <w:t xml:space="preserve">Q2: </w:t>
-      </w:r>
-      <w:r>
-        <w:rPr>
-          <w:b/>
-          <w:bCs/>
-          <w:color w:val="262626"/>
+        <w:spacing w:after="60" w:before="220"/>
+      </w:pPr>
+      <w:r>
+        <w:rPr>
+          <w:b/>
+          <w:bCs/>
+          <w:color w:val="0061C7"/>
+          <w:sz w:val="22"/>
+          <w:szCs w:val="22"/>
+        </w:rPr>
+        <w:t xml:space="preserve">Q27: </w:t>
+      </w:r>
+      <w:r>
+        <w:rPr>
+          <w:b/>
+          <w:bCs/>
+          <w:color w:val="000000"/>
           <w:sz w:val="22"/>
           <w:szCs w:val="22"/>
         </w:rPr>
@@ -1892,15 +2623,17 @@
         <w:rPr>
           <w:b/>
           <w:bCs/>
-          <w:color w:val="254498"/>
-          <w:sz w:val="22"/>
-          <w:szCs w:val="22"/>
-        </w:rPr>
-        <w:t xml:space="preserve">A2: </w:t>
-      </w:r>
-      <w:r>
-        <w:rPr>
-          <w:color w:val="262626"/>
+          <w:color w:val="0061C7"/>
+          <w:sz w:val="22"/>
+          <w:szCs w:val="22"/>
+        </w:rPr>
+        <w:t xml:space="preserve">A27: </w:t>
+      </w:r>
+      <w:r>
+        <w:rPr>
+          <w:b w:val="false"/>
+          <w:bCs w:val="false"/>
+          <w:color w:val="000000"/>
           <w:sz w:val="22"/>
           <w:szCs w:val="22"/>
         </w:rPr>
@@ -1918,7 +2651,9 @@
       </w:pPr>
       <w:r>
         <w:rPr>
-          <w:color w:val="262626"/>
+          <w:b w:val="false"/>
+          <w:bCs w:val="false"/>
+          <w:color w:val="000000"/>
           <w:sz w:val="22"/>
           <w:szCs w:val="22"/>
         </w:rPr>
@@ -1936,7 +2671,9 @@
       </w:pPr>
       <w:r>
         <w:rPr>
-          <w:color w:val="262626"/>
+          <w:b w:val="false"/>
+          <w:bCs w:val="false"/>
+          <w:color w:val="000000"/>
           <w:sz w:val="22"/>
           <w:szCs w:val="22"/>
         </w:rPr>
@@ -1954,7 +2691,9 @@
       </w:pPr>
       <w:r>
         <w:rPr>
-          <w:color w:val="262626"/>
+          <w:b w:val="false"/>
+          <w:bCs w:val="false"/>
+          <w:color w:val="000000"/>
           <w:sz w:val="22"/>
           <w:szCs w:val="22"/>
         </w:rPr>
@@ -1972,7 +2711,9 @@
       </w:pPr>
       <w:r>
         <w:rPr>
-          <w:color w:val="262626"/>
+          <w:b w:val="false"/>
+          <w:bCs w:val="false"/>
+          <w:color w:val="000000"/>
           <w:sz w:val="22"/>
           <w:szCs w:val="22"/>
         </w:rPr>
@@ -1990,7 +2731,9 @@
       </w:pPr>
       <w:r>
         <w:rPr>
-          <w:color w:val="262626"/>
+          <w:b w:val="false"/>
+          <w:bCs w:val="false"/>
+          <w:color w:val="000000"/>
           <w:sz w:val="22"/>
           <w:szCs w:val="22"/>
         </w:rPr>
@@ -2008,7 +2751,9 @@
       </w:pPr>
       <w:r>
         <w:rPr>
-          <w:color w:val="262626"/>
+          <w:b w:val="false"/>
+          <w:bCs w:val="false"/>
+          <w:color w:val="000000"/>
           <w:sz w:val="22"/>
           <w:szCs w:val="22"/>
         </w:rPr>
@@ -2017,23 +2762,23 @@
     </w:p>
     <w:p>
       <w:pPr>
-        <w:spacing w:after="60" w:before="200"/>
-      </w:pPr>
-      <w:r>
-        <w:rPr>
-          <w:b/>
-          <w:bCs/>
-          <w:color w:val="254498"/>
-          <w:sz w:val="22"/>
-          <w:szCs w:val="22"/>
-        </w:rPr>
-        <w:t xml:space="preserve">Q3: </w:t>
-      </w:r>
-      <w:r>
-        <w:rPr>
-          <w:b/>
-          <w:bCs/>
-          <w:color w:val="262626"/>
+        <w:spacing w:after="60" w:before="220"/>
+      </w:pPr>
+      <w:r>
+        <w:rPr>
+          <w:b/>
+          <w:bCs/>
+          <w:color w:val="0061C7"/>
+          <w:sz w:val="22"/>
+          <w:szCs w:val="22"/>
+        </w:rPr>
+        <w:t xml:space="preserve">Q28: </w:t>
+      </w:r>
+      <w:r>
+        <w:rPr>
+          <w:b/>
+          <w:bCs/>
+          <w:color w:val="000000"/>
           <w:sz w:val="22"/>
           <w:szCs w:val="22"/>
         </w:rPr>
@@ -2048,15 +2793,17 @@
         <w:rPr>
           <w:b/>
           <w:bCs/>
-          <w:color w:val="254498"/>
-          <w:sz w:val="22"/>
-          <w:szCs w:val="22"/>
-        </w:rPr>
-        <w:t xml:space="preserve">A3: </w:t>
-      </w:r>
-      <w:r>
-        <w:rPr>
-          <w:color w:val="262626"/>
+          <w:color w:val="0061C7"/>
+          <w:sz w:val="22"/>
+          <w:szCs w:val="22"/>
+        </w:rPr>
+        <w:t xml:space="preserve">A28: </w:t>
+      </w:r>
+      <w:r>
+        <w:rPr>
+          <w:b w:val="false"/>
+          <w:bCs w:val="false"/>
+          <w:color w:val="000000"/>
           <w:sz w:val="22"/>
           <w:szCs w:val="22"/>
         </w:rPr>
@@ -2065,23 +2812,23 @@
     </w:p>
     <w:p>
       <w:pPr>
-        <w:spacing w:after="60" w:before="200"/>
-      </w:pPr>
-      <w:r>
-        <w:rPr>
-          <w:b/>
-          <w:bCs/>
-          <w:color w:val="254498"/>
-          <w:sz w:val="22"/>
-          <w:szCs w:val="22"/>
-        </w:rPr>
-        <w:t xml:space="preserve">Q4: </w:t>
-      </w:r>
-      <w:r>
-        <w:rPr>
-          <w:b/>
-          <w:bCs/>
-          <w:color w:val="262626"/>
+        <w:spacing w:after="60" w:before="220"/>
+      </w:pPr>
+      <w:r>
+        <w:rPr>
+          <w:b/>
+          <w:bCs/>
+          <w:color w:val="0061C7"/>
+          <w:sz w:val="22"/>
+          <w:szCs w:val="22"/>
+        </w:rPr>
+        <w:t xml:space="preserve">Q29: </w:t>
+      </w:r>
+      <w:r>
+        <w:rPr>
+          <w:b/>
+          <w:bCs/>
+          <w:color w:val="000000"/>
           <w:sz w:val="22"/>
           <w:szCs w:val="22"/>
         </w:rPr>
@@ -2096,15 +2843,17 @@
         <w:rPr>
           <w:b/>
           <w:bCs/>
-          <w:color w:val="254498"/>
-          <w:sz w:val="22"/>
-          <w:szCs w:val="22"/>
-        </w:rPr>
-        <w:t xml:space="preserve">A4: </w:t>
-      </w:r>
-      <w:r>
-        <w:rPr>
-          <w:color w:val="262626"/>
+          <w:color w:val="0061C7"/>
+          <w:sz w:val="22"/>
+          <w:szCs w:val="22"/>
+        </w:rPr>
+        <w:t xml:space="preserve">A29: </w:t>
+      </w:r>
+      <w:r>
+        <w:rPr>
+          <w:b w:val="false"/>
+          <w:bCs w:val="false"/>
+          <w:color w:val="000000"/>
           <w:sz w:val="22"/>
           <w:szCs w:val="22"/>
         </w:rPr>
@@ -2122,7 +2871,9 @@
       </w:pPr>
       <w:r>
         <w:rPr>
-          <w:color w:val="262626"/>
+          <w:b w:val="false"/>
+          <w:bCs w:val="false"/>
+          <w:color w:val="000000"/>
           <w:sz w:val="22"/>
           <w:szCs w:val="22"/>
         </w:rPr>
@@ -2140,7 +2891,9 @@
       </w:pPr>
       <w:r>
         <w:rPr>
-          <w:color w:val="262626"/>
+          <w:b w:val="false"/>
+          <w:bCs w:val="false"/>
+          <w:color w:val="000000"/>
           <w:sz w:val="22"/>
           <w:szCs w:val="22"/>
         </w:rPr>
@@ -2149,23 +2902,23 @@
     </w:p>
     <w:p>
       <w:pPr>
-        <w:spacing w:after="60" w:before="200"/>
-      </w:pPr>
-      <w:r>
-        <w:rPr>
-          <w:b/>
-          <w:bCs/>
-          <w:color w:val="254498"/>
-          <w:sz w:val="22"/>
-          <w:szCs w:val="22"/>
-        </w:rPr>
-        <w:t xml:space="preserve">Q5: </w:t>
-      </w:r>
-      <w:r>
-        <w:rPr>
-          <w:b/>
-          <w:bCs/>
-          <w:color w:val="262626"/>
+        <w:spacing w:after="60" w:before="220"/>
+      </w:pPr>
+      <w:r>
+        <w:rPr>
+          <w:b/>
+          <w:bCs/>
+          <w:color w:val="0061C7"/>
+          <w:sz w:val="22"/>
+          <w:szCs w:val="22"/>
+        </w:rPr>
+        <w:t xml:space="preserve">Q30: </w:t>
+      </w:r>
+      <w:r>
+        <w:rPr>
+          <w:b/>
+          <w:bCs/>
+          <w:color w:val="000000"/>
           <w:sz w:val="22"/>
           <w:szCs w:val="22"/>
         </w:rPr>
@@ -2180,15 +2933,17 @@
         <w:rPr>
           <w:b/>
           <w:bCs/>
-          <w:color w:val="254498"/>
-          <w:sz w:val="22"/>
-          <w:szCs w:val="22"/>
-        </w:rPr>
-        <w:t xml:space="preserve">A5: </w:t>
-      </w:r>
-      <w:r>
-        <w:rPr>
-          <w:color w:val="262626"/>
+          <w:color w:val="0061C7"/>
+          <w:sz w:val="22"/>
+          <w:szCs w:val="22"/>
+        </w:rPr>
+        <w:t xml:space="preserve">A30: </w:t>
+      </w:r>
+      <w:r>
+        <w:rPr>
+          <w:b w:val="false"/>
+          <w:bCs w:val="false"/>
+          <w:color w:val="000000"/>
           <w:sz w:val="22"/>
           <w:szCs w:val="22"/>
         </w:rPr>
@@ -2206,7 +2961,9 @@
       </w:pPr>
       <w:r>
         <w:rPr>
-          <w:color w:val="262626"/>
+          <w:b w:val="false"/>
+          <w:bCs w:val="false"/>
+          <w:color w:val="000000"/>
           <w:sz w:val="22"/>
           <w:szCs w:val="22"/>
         </w:rPr>
@@ -2224,7 +2981,9 @@
       </w:pPr>
       <w:r>
         <w:rPr>
-          <w:color w:val="262626"/>
+          <w:b w:val="false"/>
+          <w:bCs w:val="false"/>
+          <w:color w:val="000000"/>
           <w:sz w:val="22"/>
           <w:szCs w:val="22"/>
         </w:rPr>
@@ -2242,7 +3001,9 @@
       </w:pPr>
       <w:r>
         <w:rPr>
-          <w:color w:val="262626"/>
+          <w:b w:val="false"/>
+          <w:bCs w:val="false"/>
+          <w:color w:val="000000"/>
           <w:sz w:val="22"/>
           <w:szCs w:val="22"/>
         </w:rPr>
@@ -2251,23 +3012,81 @@
     </w:p>
     <w:p>
       <w:pPr>
-        <w:spacing w:after="60" w:before="200"/>
-      </w:pPr>
-      <w:r>
-        <w:rPr>
-          <w:b/>
-          <w:bCs/>
-          <w:color w:val="254498"/>
-          <w:sz w:val="22"/>
-          <w:szCs w:val="22"/>
-        </w:rPr>
-        <w:t xml:space="preserve">Q6: </w:t>
-      </w:r>
-      <w:r>
-        <w:rPr>
-          <w:b/>
-          <w:bCs/>
-          <w:color w:val="262626"/>
+        <w:pStyle w:val="Heading3"/>
+        <w:pBdr>
+          <w:top w:val="single" w:color="0061C7" w:sz="8" w:space="6"/>
+          <w:left w:val="single" w:color="0061C7" w:sz="8" w:space="6"/>
+          <w:right w:val="single" w:color="0061C7" w:sz="8" w:space="6"/>
+        </w:pBdr>
+        <w:shd w:fill="D9E7F7" w:color="auto" w:val="clear"/>
+        <w:spacing w:after="0" w:before="240" w:line="300"/>
+        <w:ind w:left="160" w:right="160"/>
+      </w:pPr>
+      <w:r>
+        <w:rPr>
+          <w:b/>
+          <w:bCs/>
+          <w:color w:val="2C3A87"/>
+          <w:sz w:val="24"/>
+          <w:szCs w:val="24"/>
+        </w:rPr>
+        <w:t xml:space="preserve">Auto Financing › Other Useful Information</w:t>
+      </w:r>
+    </w:p>
+    <w:p>
+      <w:pPr>
+        <w:pBdr>
+          <w:bottom w:val="single" w:color="0061C7" w:sz="8" w:space="6"/>
+          <w:left w:val="single" w:color="0061C7" w:sz="8" w:space="6"/>
+          <w:right w:val="single" w:color="0061C7" w:sz="8" w:space="6"/>
+        </w:pBdr>
+        <w:shd w:fill="D9E7F7" w:color="auto" w:val="clear"/>
+        <w:spacing w:after="200" w:before="0" w:line="260"/>
+        <w:ind w:left="160" w:right="160"/>
+      </w:pPr>
+      <w:r>
+        <w:rPr>
+          <w:i/>
+          <w:iCs/>
+          <w:color w:val="2C3A87"/>
+          <w:sz w:val="18"/>
+          <w:szCs w:val="18"/>
+        </w:rPr>
+        <w:t xml:space="preserve">Source: </w:t>
+      </w:r>
+      <w:hyperlink w:history="1" r:id="rIdfaekazwx4gda4ms3a2zxk">
+        <w:r>
+          <w:rPr>
+            <w:i/>
+            <w:iCs/>
+            <w:color w:val="0061C7"/>
+            <w:sz w:val="18"/>
+            <w:szCs w:val="18"/>
+            <w:u w:val="single"/>
+          </w:rPr>
+          <w:t xml:space="preserve">https://www.sc.com/sg/help/auto-financing/</w:t>
+        </w:r>
+      </w:hyperlink>
+    </w:p>
+    <w:p>
+      <w:pPr>
+        <w:spacing w:after="60" w:before="220"/>
+      </w:pPr>
+      <w:r>
+        <w:rPr>
+          <w:b/>
+          <w:bCs/>
+          <w:color w:val="0061C7"/>
+          <w:sz w:val="22"/>
+          <w:szCs w:val="22"/>
+        </w:rPr>
+        <w:t xml:space="preserve">Q31: </w:t>
+      </w:r>
+      <w:r>
+        <w:rPr>
+          <w:b/>
+          <w:bCs/>
+          <w:color w:val="000000"/>
           <w:sz w:val="22"/>
           <w:szCs w:val="22"/>
         </w:rPr>
@@ -2282,15 +3101,17 @@
         <w:rPr>
           <w:b/>
           <w:bCs/>
-          <w:color w:val="254498"/>
-          <w:sz w:val="22"/>
-          <w:szCs w:val="22"/>
-        </w:rPr>
-        <w:t xml:space="preserve">A6: </w:t>
-      </w:r>
-      <w:r>
-        <w:rPr>
-          <w:color w:val="262626"/>
+          <w:color w:val="0061C7"/>
+          <w:sz w:val="22"/>
+          <w:szCs w:val="22"/>
+        </w:rPr>
+        <w:t xml:space="preserve">A31: </w:t>
+      </w:r>
+      <w:r>
+        <w:rPr>
+          <w:b w:val="false"/>
+          <w:bCs w:val="false"/>
+          <w:color w:val="000000"/>
           <w:sz w:val="22"/>
           <w:szCs w:val="22"/>
         </w:rPr>
@@ -2308,7 +3129,9 @@
       </w:pPr>
       <w:r>
         <w:rPr>
-          <w:color w:val="262626"/>
+          <w:b w:val="false"/>
+          <w:bCs w:val="false"/>
+          <w:color w:val="000000"/>
           <w:sz w:val="22"/>
           <w:szCs w:val="22"/>
         </w:rPr>
@@ -2326,7 +3149,9 @@
       </w:pPr>
       <w:r>
         <w:rPr>
-          <w:color w:val="262626"/>
+          <w:b w:val="false"/>
+          <w:bCs w:val="false"/>
+          <w:color w:val="000000"/>
           <w:sz w:val="22"/>
           <w:szCs w:val="22"/>
         </w:rPr>
@@ -2344,7 +3169,9 @@
       </w:pPr>
       <w:r>
         <w:rPr>
-          <w:color w:val="262626"/>
+          <w:b w:val="false"/>
+          <w:bCs w:val="false"/>
+          <w:color w:val="000000"/>
           <w:sz w:val="22"/>
           <w:szCs w:val="22"/>
         </w:rPr>
@@ -2362,7 +3189,9 @@
       </w:pPr>
       <w:r>
         <w:rPr>
-          <w:color w:val="262626"/>
+          <w:b w:val="false"/>
+          <w:bCs w:val="false"/>
+          <w:color w:val="000000"/>
           <w:sz w:val="22"/>
           <w:szCs w:val="22"/>
         </w:rPr>
@@ -2380,7 +3209,9 @@
       </w:pPr>
       <w:r>
         <w:rPr>
-          <w:color w:val="262626"/>
+          <w:b w:val="false"/>
+          <w:bCs w:val="false"/>
+          <w:color w:val="000000"/>
           <w:sz w:val="22"/>
           <w:szCs w:val="22"/>
         </w:rPr>
@@ -2389,23 +3220,23 @@
     </w:p>
     <w:p>
       <w:pPr>
-        <w:spacing w:after="60" w:before="200"/>
-      </w:pPr>
-      <w:r>
-        <w:rPr>
-          <w:b/>
-          <w:bCs/>
-          <w:color w:val="254498"/>
-          <w:sz w:val="22"/>
-          <w:szCs w:val="22"/>
-        </w:rPr>
-        <w:t xml:space="preserve">Q7: </w:t>
-      </w:r>
-      <w:r>
-        <w:rPr>
-          <w:b/>
-          <w:bCs/>
-          <w:color w:val="262626"/>
+        <w:spacing w:after="60" w:before="220"/>
+      </w:pPr>
+      <w:r>
+        <w:rPr>
+          <w:b/>
+          <w:bCs/>
+          <w:color w:val="0061C7"/>
+          <w:sz w:val="22"/>
+          <w:szCs w:val="22"/>
+        </w:rPr>
+        <w:t xml:space="preserve">Q32: </w:t>
+      </w:r>
+      <w:r>
+        <w:rPr>
+          <w:b/>
+          <w:bCs/>
+          <w:color w:val="000000"/>
           <w:sz w:val="22"/>
           <w:szCs w:val="22"/>
         </w:rPr>
@@ -2420,15 +3251,17 @@
         <w:rPr>
           <w:b/>
           <w:bCs/>
-          <w:color w:val="254498"/>
-          <w:sz w:val="22"/>
-          <w:szCs w:val="22"/>
-        </w:rPr>
-        <w:t xml:space="preserve">A7: </w:t>
-      </w:r>
-      <w:r>
-        <w:rPr>
-          <w:color w:val="262626"/>
+          <w:color w:val="0061C7"/>
+          <w:sz w:val="22"/>
+          <w:szCs w:val="22"/>
+        </w:rPr>
+        <w:t xml:space="preserve">A32: </w:t>
+      </w:r>
+      <w:r>
+        <w:rPr>
+          <w:b w:val="false"/>
+          <w:bCs w:val="false"/>
+          <w:color w:val="000000"/>
           <w:sz w:val="22"/>
           <w:szCs w:val="22"/>
         </w:rPr>
@@ -2437,23 +3270,23 @@
     </w:p>
     <w:p>
       <w:pPr>
-        <w:spacing w:after="60" w:before="200"/>
-      </w:pPr>
-      <w:r>
-        <w:rPr>
-          <w:b/>
-          <w:bCs/>
-          <w:color w:val="254498"/>
-          <w:sz w:val="22"/>
-          <w:szCs w:val="22"/>
-        </w:rPr>
-        <w:t xml:space="preserve">Q8: </w:t>
-      </w:r>
-      <w:r>
-        <w:rPr>
-          <w:b/>
-          <w:bCs/>
-          <w:color w:val="262626"/>
+        <w:spacing w:after="60" w:before="220"/>
+      </w:pPr>
+      <w:r>
+        <w:rPr>
+          <w:b/>
+          <w:bCs/>
+          <w:color w:val="0061C7"/>
+          <w:sz w:val="22"/>
+          <w:szCs w:val="22"/>
+        </w:rPr>
+        <w:t xml:space="preserve">Q33: </w:t>
+      </w:r>
+      <w:r>
+        <w:rPr>
+          <w:b/>
+          <w:bCs/>
+          <w:color w:val="000000"/>
           <w:sz w:val="22"/>
           <w:szCs w:val="22"/>
         </w:rPr>
@@ -2468,15 +3301,17 @@
         <w:rPr>
           <w:b/>
           <w:bCs/>
-          <w:color w:val="254498"/>
-          <w:sz w:val="22"/>
-          <w:szCs w:val="22"/>
-        </w:rPr>
-        <w:t xml:space="preserve">A8: </w:t>
-      </w:r>
-      <w:r>
-        <w:rPr>
-          <w:color w:val="262626"/>
+          <w:color w:val="0061C7"/>
+          <w:sz w:val="22"/>
+          <w:szCs w:val="22"/>
+        </w:rPr>
+        <w:t xml:space="preserve">A33: </w:t>
+      </w:r>
+      <w:r>
+        <w:rPr>
+          <w:b w:val="false"/>
+          <w:bCs w:val="false"/>
+          <w:color w:val="000000"/>
           <w:sz w:val="22"/>
           <w:szCs w:val="22"/>
         </w:rPr>
@@ -2690,7 +3525,7 @@
     <w:rPrDefault>
       <w:rPr>
         <w:rFonts w:ascii="Calibri" w:cs="Calibri" w:eastAsia="Calibri" w:hAnsi="Calibri"/>
-        <w:color w:val="262626"/>
+        <w:color w:val="000000"/>
         <w:sz w:val="22"/>
         <w:szCs w:val="22"/>
       </w:rPr>
@@ -2877,9 +3712,9 @@
       <w:rFonts w:ascii="Calibri" w:cs="Calibri" w:eastAsia="Calibri" w:hAnsi="Calibri"/>
       <w:b/>
       <w:bCs/>
-      <w:color w:val="254498"/>
-      <w:sz w:val="30"/>
-      <w:szCs w:val="30"/>
+      <w:color w:val="FFFFFF"/>
+      <w:sz w:val="40"/>
+      <w:szCs w:val="40"/>
     </w:rPr>
   </w:style>
   <w:style w:type="paragraph" w:styleId="Heading2">
@@ -2891,9 +3726,23 @@
       <w:rFonts w:ascii="Calibri" w:cs="Calibri" w:eastAsia="Calibri" w:hAnsi="Calibri"/>
       <w:b/>
       <w:bCs/>
-      <w:color w:val="254498"/>
-      <w:sz w:val="26"/>
-      <w:szCs w:val="26"/>
+      <w:color w:val="FFFFFF"/>
+      <w:sz w:val="28"/>
+      <w:szCs w:val="28"/>
+    </w:rPr>
+  </w:style>
+  <w:style w:type="paragraph" w:styleId="Heading3">
+    <w:name w:val="Heading 3"/>
+    <w:basedOn w:val="Normal"/>
+    <w:next w:val="Normal"/>
+    <w:qFormat/>
+    <w:rPr>
+      <w:rFonts w:ascii="Calibri" w:cs="Calibri" w:eastAsia="Calibri" w:hAnsi="Calibri"/>
+      <w:b/>
+      <w:bCs/>
+      <w:color w:val="2C3A87"/>
+      <w:sz w:val="24"/>
+      <w:szCs w:val="24"/>
     </w:rPr>
   </w:style>
 </w:styles>

</xml_diff>

<commit_message>
Align title banner text by moving both lines into one table cell
The eyebrow label and the title carried identical paragraph indents, but
their left edges still read as staggered because glyph side bearings
differ between the 10pt label and the 20pt title.

Wrap both lines in a single full-width, borderless table cell that
supplies the blue fill and the only horizontal padding (260 twips on all
four sides, set once at table level). Neither paragraph carries an indent
now, so the two lines share one left offset and cannot drift apart, and a
wrapped line would start at the same edge. Page size is pinned to A4 so
the banner width stays matched to the text column.

Co-Authored-By: Claude Opus 5 <noreply@anthropic.com>
Claude-Session: https://claude.ai/code/session_01LumFsFKRxh67B7Hnvhc4FT
</commit_message>
<xml_diff>
--- a/SCB_Bank_Help_FAQ.docx
+++ b/SCB_Bank_Help_FAQ.docx
@@ -2,42 +2,76 @@
 <file path=word/document.xml><?xml version="1.0" encoding="utf-8"?>
 <w:document xmlns:wpc="http://schemas.microsoft.com/office/word/2010/wordprocessingCanvas" xmlns:mc="http://schemas.openxmlformats.org/markup-compatibility/2006" xmlns:o="urn:schemas-microsoft-com:office:office" xmlns:r="http://schemas.openxmlformats.org/officeDocument/2006/relationships" xmlns:m="http://schemas.openxmlformats.org/officeDocument/2006/math" xmlns:v="urn:schemas-microsoft-com:vml" xmlns:wp14="http://schemas.microsoft.com/office/word/2010/wordprocessingDrawing" xmlns:wp="http://schemas.openxmlformats.org/drawingml/2006/wordprocessingDrawing" xmlns:w10="urn:schemas-microsoft-com:office:word" xmlns:w="http://schemas.openxmlformats.org/wordprocessingml/2006/main" xmlns:w14="http://schemas.microsoft.com/office/word/2010/wordml" xmlns:w15="http://schemas.microsoft.com/office/word/2012/wordml" xmlns:wpg="http://schemas.microsoft.com/office/word/2010/wordprocessingGroup" xmlns:wpi="http://schemas.microsoft.com/office/word/2010/wordprocessingInk" xmlns:wne="http://schemas.microsoft.com/office/word/2006/wordml" xmlns:wps="http://schemas.microsoft.com/office/word/2010/wordprocessingShape" xmlns:cx="http://schemas.microsoft.com/office/drawing/2014/chartex" xmlns:cx1="http://schemas.microsoft.com/office/drawing/2015/9/8/chartex" xmlns:cx2="http://schemas.microsoft.com/office/drawing/2015/10/21/chartex" xmlns:cx3="http://schemas.microsoft.com/office/drawing/2016/5/9/chartex" xmlns:cx4="http://schemas.microsoft.com/office/drawing/2016/5/10/chartex" xmlns:cx5="http://schemas.microsoft.com/office/drawing/2016/5/11/chartex" xmlns:cx6="http://schemas.microsoft.com/office/drawing/2016/5/12/chartex" xmlns:cx7="http://schemas.microsoft.com/office/drawing/2016/5/13/chartex" xmlns:cx8="http://schemas.microsoft.com/office/drawing/2016/5/14/chartex" xmlns:aink="http://schemas.microsoft.com/office/drawing/2016/ink" xmlns:am3d="http://schemas.microsoft.com/office/drawing/2017/model3d" xmlns:w16cex="http://schemas.microsoft.com/office/word/2018/wordml/cex" xmlns:w16cid="http://schemas.microsoft.com/office/word/2016/wordml/cid" xmlns:w16="http://schemas.microsoft.com/office/word/2018/wordml" xmlns:w16sdtdh="http://schemas.microsoft.com/office/word/2020/wordml/sdtdatahash" xmlns:w16se="http://schemas.microsoft.com/office/word/2015/wordml/symex" mc:Ignorable="w14 w15 wp14">
   <w:body>
-    <w:p>
-      <w:pPr>
-        <w:shd w:fill="0061C7" w:color="auto" w:val="clear"/>
-        <w:spacing w:after="0" w:before="240" w:line="260"/>
-        <w:ind w:left="240" w:right="240"/>
-      </w:pPr>
-      <w:r>
-        <w:rPr>
-          <w:b/>
-          <w:bCs/>
-          <w:smallCaps/>
-          <w:color w:val="92E773"/>
-          <w:spacing w:val="80"/>
-          <w:sz w:val="20"/>
-          <w:szCs w:val="20"/>
-        </w:rPr>
-        <w:t xml:space="preserve">Standard Chartered Singapore</w:t>
-      </w:r>
-    </w:p>
-    <w:p>
-      <w:pPr>
-        <w:pStyle w:val="Heading1"/>
-        <w:shd w:fill="0061C7" w:color="auto" w:val="clear"/>
-        <w:spacing w:after="300" w:before="60" w:line="420"/>
-        <w:ind w:left="240" w:right="240"/>
-      </w:pPr>
-      <w:r>
-        <w:rPr>
-          <w:b/>
-          <w:bCs/>
-          <w:color w:val="FFFFFF"/>
-          <w:sz w:val="40"/>
-          <w:szCs w:val="40"/>
-        </w:rPr>
-        <w:t xml:space="preserve">Standard Chartered Singapore Help Centre FAQ</w:t>
-      </w:r>
+    <w:tbl>
+      <w:tblPr>
+        <w:tblW w:type="dxa" w:w="9746"/>
+        <w:tblBorders>
+          <w:top w:val="none" w:color="auto" w:sz="0"/>
+          <w:left w:val="none" w:color="auto" w:sz="0"/>
+          <w:bottom w:val="none" w:color="auto" w:sz="0"/>
+          <w:right w:val="none" w:color="auto" w:sz="0"/>
+          <w:insideH w:val="none" w:color="auto" w:sz="0"/>
+          <w:insideV w:val="none" w:color="auto" w:sz="0"/>
+        </w:tblBorders>
+        <w:tblLayout w:type="fixed"/>
+        <w:tblCellMar>
+          <w:top w:type="dxa" w:w="260"/>
+          <w:left w:type="dxa" w:w="260"/>
+          <w:bottom w:type="dxa" w:w="260"/>
+          <w:right w:type="dxa" w:w="260"/>
+        </w:tblCellMar>
+      </w:tblPr>
+      <w:tblGrid>
+        <w:gridCol w:w="9746"/>
+      </w:tblGrid>
+      <w:tr>
+        <w:tc>
+          <w:tcPr>
+            <w:tcW w:type="dxa" w:w="9746"/>
+            <w:shd w:fill="0061C7" w:color="auto" w:val="clear"/>
+          </w:tcPr>
+          <w:p>
+            <w:pPr>
+              <w:spacing w:after="0" w:before="0" w:line="260"/>
+              <w:ind w:left="0" w:right="0"/>
+            </w:pPr>
+            <w:r>
+              <w:rPr>
+                <w:b/>
+                <w:bCs/>
+                <w:smallCaps/>
+                <w:color w:val="92E773"/>
+                <w:spacing w:val="80"/>
+                <w:sz w:val="20"/>
+                <w:szCs w:val="20"/>
+              </w:rPr>
+              <w:t xml:space="preserve">Standard Chartered Singapore</w:t>
+            </w:r>
+          </w:p>
+          <w:p>
+            <w:pPr>
+              <w:pStyle w:val="Heading1"/>
+              <w:spacing w:after="0" w:before="60" w:line="420"/>
+              <w:ind w:left="0" w:right="0"/>
+            </w:pPr>
+            <w:r>
+              <w:rPr>
+                <w:b/>
+                <w:bCs/>
+                <w:color w:val="FFFFFF"/>
+                <w:sz w:val="40"/>
+                <w:szCs w:val="40"/>
+              </w:rPr>
+              <w:t xml:space="preserve">Standard Chartered Singapore Help Centre FAQ</w:t>
+            </w:r>
+          </w:p>
+        </w:tc>
+      </w:tr>
+    </w:tbl>
+    <w:p>
+      <w:pPr>
+        <w:spacing w:after="0" w:before="0" w:line="240"/>
+      </w:pPr>
     </w:p>
     <w:p>
       <w:pPr>
@@ -101,7 +135,7 @@
         </w:rPr>
         <w:t xml:space="preserve">Source: </w:t>
       </w:r>
-      <w:hyperlink w:history="1" r:id="rIdul-ua7qf1xoffv0bfr5ci">
+      <w:hyperlink w:history="1" r:id="rIdpwgxewkhfcegdia7rm2l4">
         <w:r>
           <w:rPr>
             <w:i/>
@@ -304,7 +338,7 @@
         </w:rPr>
         <w:t xml:space="preserve">To update a registered mobile number, log in to </w:t>
       </w:r>
-      <w:hyperlink w:history="1" r:id="rId6ncvoejtwrldyhkbxqdj0">
+      <w:hyperlink w:history="1" r:id="rIdl6hzvttb8uhnc33ygqks9">
         <w:r>
           <w:rPr>
             <w:color w:val="0061C7"/>
@@ -325,7 +359,7 @@
         </w:rPr>
         <w:t xml:space="preserve"> or </w:t>
       </w:r>
-      <w:hyperlink w:history="1" r:id="rId6nn5h_adcmx8rqitskjkr">
+      <w:hyperlink w:history="1" r:id="rIdsbugu4pif-4xmok17z4qn">
         <w:r>
           <w:rPr>
             <w:color w:val="0061C7"/>
@@ -446,7 +480,7 @@
         </w:rPr>
         <w:t xml:space="preserve">A Standard Chartered ATM, debit or credit card can be activated and its PIN set through </w:t>
       </w:r>
-      <w:hyperlink w:history="1" r:id="rIdp7bapsgqtvv0c6d8tvq1u">
+      <w:hyperlink w:history="1" r:id="rId5vegzsukiokhfutcf_7lo">
         <w:r>
           <w:rPr>
             <w:color w:val="0061C7"/>
@@ -467,7 +501,7 @@
         </w:rPr>
         <w:t xml:space="preserve"> or </w:t>
       </w:r>
-      <w:hyperlink w:history="1" r:id="rIdiozcyzgampw08itr5zzog">
+      <w:hyperlink w:history="1" r:id="rIdy6bjfasv2kffzazc-q4zd">
         <w:r>
           <w:rPr>
             <w:color w:val="0061C7"/>
@@ -638,7 +672,7 @@
         </w:rPr>
         <w:t xml:space="preserve">A Standard Chartered card can also be activated through the Bank’s online card activation form at </w:t>
       </w:r>
-      <w:hyperlink w:history="1" r:id="rId53jjz_oovqejvuaa0twux">
+      <w:hyperlink w:history="1" r:id="rIdxngz3jyduoeegvwn6wcag">
         <w:r>
           <w:rPr>
             <w:color w:val="0061C7"/>
@@ -659,7 +693,7 @@
         </w:rPr>
         <w:t xml:space="preserve">. Further answers on card activation are published at </w:t>
       </w:r>
-      <w:hyperlink w:history="1" r:id="rIdpdhgutnx5cpkley7k0ftl">
+      <w:hyperlink w:history="1" r:id="rIdkj_xjax5y0wg-aap4yvcr">
         <w:r>
           <w:rPr>
             <w:color w:val="0061C7"/>
@@ -680,7 +714,7 @@
         </w:rPr>
         <w:t xml:space="preserve">, and general guidance is available on the Association of Banks in Singapore website at </w:t>
       </w:r>
-      <w:hyperlink w:history="1" r:id="rIdj5dzvwg8wksosn_l6shwn">
+      <w:hyperlink w:history="1" r:id="rIdblc5x126wg9ezsmdtos2a">
         <w:r>
           <w:rPr>
             <w:color w:val="0061C7"/>
@@ -751,7 +785,7 @@
         </w:rPr>
         <w:t xml:space="preserve">SC Mobile is Standard Chartered’s mobile banking app and is available free of charge on the </w:t>
       </w:r>
-      <w:hyperlink w:history="1" r:id="rIdn_2abbrtqe5guszqmjuer">
+      <w:hyperlink w:history="1" r:id="rIda4hnqovbz7iygmersjbnx">
         <w:r>
           <w:rPr>
             <w:color w:val="0061C7"/>
@@ -772,7 +806,7 @@
         </w:rPr>
         <w:t xml:space="preserve"> and </w:t>
       </w:r>
-      <w:hyperlink w:history="1" r:id="rIdk1zxxhzp2bfsaxt3v0wby">
+      <w:hyperlink w:history="1" r:id="rIdk_0cxxdprdq1y9vrfjkuk">
         <w:r>
           <w:rPr>
             <w:color w:val="0061C7"/>
@@ -1173,7 +1207,7 @@
         </w:rPr>
         <w:t xml:space="preserve">Overseas card usage can be enabled or disabled using the Bank’s online form at </w:t>
       </w:r>
-      <w:hyperlink w:history="1" r:id="rIdfpyuzjvybzmmd1wmwsw5m">
+      <w:hyperlink w:history="1" r:id="rIduhzhlsiodwt6bxl3kejnd">
         <w:r>
           <w:rPr>
             <w:color w:val="0061C7"/>
@@ -1194,7 +1228,7 @@
         </w:rPr>
         <w:t xml:space="preserve">, or through </w:t>
       </w:r>
-      <w:hyperlink w:history="1" r:id="rIdisgbvosojolj11ywcn4zz">
+      <w:hyperlink w:history="1" r:id="rIdmsk_cdeb5uqmvekj-yrs3">
         <w:r>
           <w:rPr>
             <w:color w:val="0061C7"/>
@@ -1215,7 +1249,7 @@
         </w:rPr>
         <w:t xml:space="preserve">. This can only be done after the card has been activated. Further answers on overseas card usage are published at </w:t>
       </w:r>
-      <w:hyperlink w:history="1" r:id="rIdzqudbbz-o4vh8no9vhyy5">
+      <w:hyperlink w:history="1" r:id="rIdr3ddrzuep0qicitjunhpc">
         <w:r>
           <w:rPr>
             <w:color w:val="0061C7"/>
@@ -1236,7 +1270,7 @@
         </w:rPr>
         <w:t xml:space="preserve">, and general guidance is available on the Association of Banks in Singapore website at </w:t>
       </w:r>
-      <w:hyperlink w:history="1" r:id="rIdtndno9wxztnq4ls8fbwhr">
+      <w:hyperlink w:history="1" r:id="rIdsd6dnmsjuxi5gjobwkttc">
         <w:r>
           <w:rPr>
             <w:color w:val="0061C7"/>
@@ -1407,7 +1441,7 @@
         </w:rPr>
         <w:t xml:space="preserve">Overseas card usage enabled by SMS is valid for 12 months from the date of activation. To enable overseas usage perpetually instead, replace the keyword “AOT” with “AOTP” in the SMS. An expiry date for overseas usage can be set if the function is enabled through the Bank’s online form at </w:t>
       </w:r>
-      <w:hyperlink w:history="1" r:id="rIdwqzy0co6l6bkjbyyq-avi">
+      <w:hyperlink w:history="1" r:id="rIdmy7aznvoireo2cbzcvcbf">
         <w:r>
           <w:rPr>
             <w:color w:val="0061C7"/>
@@ -1578,7 +1612,7 @@
         </w:rPr>
         <w:t xml:space="preserve">A Standard Chartered card PIN can be set or changed in </w:t>
       </w:r>
-      <w:hyperlink w:history="1" r:id="rId0bezsyqiekdsatd-pxx5n">
+      <w:hyperlink w:history="1" r:id="rIdsngee8rg6z5kemjvh4qff">
         <w:r>
           <w:rPr>
             <w:color w:val="0061C7"/>
@@ -1874,7 +1908,7 @@
         </w:rPr>
         <w:t xml:space="preserve">Source: </w:t>
       </w:r>
-      <w:hyperlink w:history="1" r:id="rIdlpnhib7mf3svb1xwdvc1b">
+      <w:hyperlink w:history="1" r:id="rIdccqvzulkyszn905dptkxp">
         <w:r>
           <w:rPr>
             <w:i/>
@@ -1937,7 +1971,7 @@
         </w:rPr>
         <w:t xml:space="preserve">A Standard Chartered card should be reported if it is lost or stolen, or if its PIN has been disclosed to a third person. The report can be made by logging in to </w:t>
       </w:r>
-      <w:hyperlink w:history="1" r:id="rIdgrs1ftnqsn0fsypj923er">
+      <w:hyperlink w:history="1" r:id="rId_onynbqecndsk3rpf_hes">
         <w:r>
           <w:rPr>
             <w:color w:val="0061C7"/>
@@ -1958,7 +1992,7 @@
         </w:rPr>
         <w:t xml:space="preserve"> or </w:t>
       </w:r>
-      <w:hyperlink w:history="1" r:id="rIdolicaaq-h85vaxu78mclo">
+      <w:hyperlink w:history="1" r:id="rIdi3drxjbnidv7ylclbwiug">
         <w:r>
           <w:rPr>
             <w:color w:val="0061C7"/>
@@ -2029,7 +2063,7 @@
         </w:rPr>
         <w:t xml:space="preserve">A lost or stolen Standard Chartered card is reported through </w:t>
       </w:r>
-      <w:hyperlink w:history="1" r:id="rIdmrvrvmx7hw5o-3ogh6oq5">
+      <w:hyperlink w:history="1" r:id="rIdvnjepz3nw1aod6pttvyyi">
         <w:r>
           <w:rPr>
             <w:color w:val="0061C7"/>
@@ -2050,7 +2084,7 @@
         </w:rPr>
         <w:t xml:space="preserve"> or </w:t>
       </w:r>
-      <w:hyperlink w:history="1" r:id="rIdsedldjhwuabfgvcvx2ig0">
+      <w:hyperlink w:history="1" r:id="rIda9lhbbms9wpgbzzjjw1xt">
         <w:r>
           <w:rPr>
             <w:color w:val="0061C7"/>
@@ -2271,7 +2305,7 @@
         </w:rPr>
         <w:t xml:space="preserve">A Standard Chartered credit or debit/ATM card PIN is reset through </w:t>
       </w:r>
-      <w:hyperlink w:history="1" r:id="rIdkr10-gj2eewegn3kgu58v">
+      <w:hyperlink w:history="1" r:id="rIdvpeo3i6knxvi2ripqoicn">
         <w:r>
           <w:rPr>
             <w:color w:val="0061C7"/>
@@ -2292,7 +2326,7 @@
         </w:rPr>
         <w:t xml:space="preserve"> or </w:t>
       </w:r>
-      <w:hyperlink w:history="1" r:id="rIdxg7ur9br8ukhfxgr4blou">
+      <w:hyperlink w:history="1" r:id="rIdoy_-gbzleaayiiygfwdvv">
         <w:r>
           <w:rPr>
             <w:color w:val="0061C7"/>
@@ -2526,7 +2560,7 @@
         </w:rPr>
         <w:t xml:space="preserve">Source: </w:t>
       </w:r>
-      <w:hyperlink w:history="1" r:id="rIdxznwbduukhgushqpphx2w">
+      <w:hyperlink w:history="1" r:id="rIdrefnsdq_rxjsgxxuk8jgn">
         <w:r>
           <w:rPr>
             <w:i/>
@@ -3054,7 +3088,7 @@
         </w:rPr>
         <w:t xml:space="preserve">Source: </w:t>
       </w:r>
-      <w:hyperlink w:history="1" r:id="rIdfaekazwx4gda4ms3a2zxk">
+      <w:hyperlink w:history="1" r:id="rIdymr3mc87j0gi6w_ildesp">
         <w:r>
           <w:rPr>
             <w:i/>

</xml_diff>

<commit_message>
Add Standard Chartered Singapore Credit Cards FAQ document
Scrape the 12 credit card pages on sc.com/sg and generate
SCB_Bank_Credit_Cards_FAQ.docx, a RAG-ready FAQ organised as 6 categories
> 13 card subcategories > 138 continuously numbered Q&A pairs.

- Extract the on-page FAQ accordions plus the Fees & Charges, Eligibility
  & Documents and card-benefit sections from each page
- Answers rewritten to be self-contained, with contact-centre numbers and
  the credit bureau phone number excluded
- Record that the Platinum Visa / Mastercard Credit Card is no longer
  offered
- Extract the shared house style into faq_doc_builder.js so the Help and
  Credit Cards documents cannot drift apart; the Help document output is
  unchanged apart from generated relationship IDs and timestamps

Co-Authored-By: Claude Opus 5 <noreply@anthropic.com>
Claude-Session: https://claude.ai/code/session_01LumFsFKRxh67B7Hnvhc4FT
</commit_message>
<xml_diff>
--- a/SCB_Bank_Help_FAQ.docx
+++ b/SCB_Bank_Help_FAQ.docx
@@ -135,7 +135,7 @@
         </w:rPr>
         <w:t xml:space="preserve">Source: </w:t>
       </w:r>
-      <w:hyperlink w:history="1" r:id="rIdpwgxewkhfcegdia7rm2l4">
+      <w:hyperlink w:history="1" r:id="rIdnnyrnh8cvpf28r6jedda7">
         <w:r>
           <w:rPr>
             <w:i/>
@@ -338,7 +338,7 @@
         </w:rPr>
         <w:t xml:space="preserve">To update a registered mobile number, log in to </w:t>
       </w:r>
-      <w:hyperlink w:history="1" r:id="rIdl6hzvttb8uhnc33ygqks9">
+      <w:hyperlink w:history="1" r:id="rIdwba9egj9cstwcgaq05qfc">
         <w:r>
           <w:rPr>
             <w:color w:val="0061C7"/>
@@ -359,7 +359,7 @@
         </w:rPr>
         <w:t xml:space="preserve"> or </w:t>
       </w:r>
-      <w:hyperlink w:history="1" r:id="rIdsbugu4pif-4xmok17z4qn">
+      <w:hyperlink w:history="1" r:id="rIdd4tvl19bfq5xoylkhzocz">
         <w:r>
           <w:rPr>
             <w:color w:val="0061C7"/>
@@ -480,7 +480,7 @@
         </w:rPr>
         <w:t xml:space="preserve">A Standard Chartered ATM, debit or credit card can be activated and its PIN set through </w:t>
       </w:r>
-      <w:hyperlink w:history="1" r:id="rId5vegzsukiokhfutcf_7lo">
+      <w:hyperlink w:history="1" r:id="rIduzund-hpsm-sbzfbicvsc">
         <w:r>
           <w:rPr>
             <w:color w:val="0061C7"/>
@@ -501,7 +501,7 @@
         </w:rPr>
         <w:t xml:space="preserve"> or </w:t>
       </w:r>
-      <w:hyperlink w:history="1" r:id="rIdy6bjfasv2kffzazc-q4zd">
+      <w:hyperlink w:history="1" r:id="rIdrymyu_qvy359sadc939b9">
         <w:r>
           <w:rPr>
             <w:color w:val="0061C7"/>
@@ -672,7 +672,7 @@
         </w:rPr>
         <w:t xml:space="preserve">A Standard Chartered card can also be activated through the Bank’s online card activation form at </w:t>
       </w:r>
-      <w:hyperlink w:history="1" r:id="rIdxngz3jyduoeegvwn6wcag">
+      <w:hyperlink w:history="1" r:id="rIdhldl34vjn333ypofzkwvc">
         <w:r>
           <w:rPr>
             <w:color w:val="0061C7"/>
@@ -693,7 +693,7 @@
         </w:rPr>
         <w:t xml:space="preserve">. Further answers on card activation are published at </w:t>
       </w:r>
-      <w:hyperlink w:history="1" r:id="rIdkj_xjax5y0wg-aap4yvcr">
+      <w:hyperlink w:history="1" r:id="rIdoy64z8utt3368va2ow5cf">
         <w:r>
           <w:rPr>
             <w:color w:val="0061C7"/>
@@ -714,7 +714,7 @@
         </w:rPr>
         <w:t xml:space="preserve">, and general guidance is available on the Association of Banks in Singapore website at </w:t>
       </w:r>
-      <w:hyperlink w:history="1" r:id="rIdblc5x126wg9ezsmdtos2a">
+      <w:hyperlink w:history="1" r:id="rIdycno3db2pg7ydgkqagj36">
         <w:r>
           <w:rPr>
             <w:color w:val="0061C7"/>
@@ -785,7 +785,7 @@
         </w:rPr>
         <w:t xml:space="preserve">SC Mobile is Standard Chartered’s mobile banking app and is available free of charge on the </w:t>
       </w:r>
-      <w:hyperlink w:history="1" r:id="rIda4hnqovbz7iygmersjbnx">
+      <w:hyperlink w:history="1" r:id="rIdhky53s9tq5yxyaozrwlzs">
         <w:r>
           <w:rPr>
             <w:color w:val="0061C7"/>
@@ -806,7 +806,7 @@
         </w:rPr>
         <w:t xml:space="preserve"> and </w:t>
       </w:r>
-      <w:hyperlink w:history="1" r:id="rIdk_0cxxdprdq1y9vrfjkuk">
+      <w:hyperlink w:history="1" r:id="rIduvfyftkw0_zokawtoxtvi">
         <w:r>
           <w:rPr>
             <w:color w:val="0061C7"/>
@@ -1207,7 +1207,7 @@
         </w:rPr>
         <w:t xml:space="preserve">Overseas card usage can be enabled or disabled using the Bank’s online form at </w:t>
       </w:r>
-      <w:hyperlink w:history="1" r:id="rIduhzhlsiodwt6bxl3kejnd">
+      <w:hyperlink w:history="1" r:id="rIdg0y4eyss0ldrly80672ix">
         <w:r>
           <w:rPr>
             <w:color w:val="0061C7"/>
@@ -1228,7 +1228,7 @@
         </w:rPr>
         <w:t xml:space="preserve">, or through </w:t>
       </w:r>
-      <w:hyperlink w:history="1" r:id="rIdmsk_cdeb5uqmvekj-yrs3">
+      <w:hyperlink w:history="1" r:id="rIdp7h_h1kmctw8ktagx7a-x">
         <w:r>
           <w:rPr>
             <w:color w:val="0061C7"/>
@@ -1249,7 +1249,7 @@
         </w:rPr>
         <w:t xml:space="preserve">. This can only be done after the card has been activated. Further answers on overseas card usage are published at </w:t>
       </w:r>
-      <w:hyperlink w:history="1" r:id="rIdr3ddrzuep0qicitjunhpc">
+      <w:hyperlink w:history="1" r:id="rIdcrjtwsyvd6sdoayotdfzr">
         <w:r>
           <w:rPr>
             <w:color w:val="0061C7"/>
@@ -1270,7 +1270,7 @@
         </w:rPr>
         <w:t xml:space="preserve">, and general guidance is available on the Association of Banks in Singapore website at </w:t>
       </w:r>
-      <w:hyperlink w:history="1" r:id="rIdsd6dnmsjuxi5gjobwkttc">
+      <w:hyperlink w:history="1" r:id="rIdh3p8d6i9ze6mczspisbyv">
         <w:r>
           <w:rPr>
             <w:color w:val="0061C7"/>
@@ -1441,7 +1441,7 @@
         </w:rPr>
         <w:t xml:space="preserve">Overseas card usage enabled by SMS is valid for 12 months from the date of activation. To enable overseas usage perpetually instead, replace the keyword “AOT” with “AOTP” in the SMS. An expiry date for overseas usage can be set if the function is enabled through the Bank’s online form at </w:t>
       </w:r>
-      <w:hyperlink w:history="1" r:id="rIdmy7aznvoireo2cbzcvcbf">
+      <w:hyperlink w:history="1" r:id="rIdr7zas_ye9goapjlg85edc">
         <w:r>
           <w:rPr>
             <w:color w:val="0061C7"/>
@@ -1612,7 +1612,7 @@
         </w:rPr>
         <w:t xml:space="preserve">A Standard Chartered card PIN can be set or changed in </w:t>
       </w:r>
-      <w:hyperlink w:history="1" r:id="rIdsngee8rg6z5kemjvh4qff">
+      <w:hyperlink w:history="1" r:id="rIdrekka9vnrfcp6onq8c-j7">
         <w:r>
           <w:rPr>
             <w:color w:val="0061C7"/>
@@ -1908,7 +1908,7 @@
         </w:rPr>
         <w:t xml:space="preserve">Source: </w:t>
       </w:r>
-      <w:hyperlink w:history="1" r:id="rIdccqvzulkyszn905dptkxp">
+      <w:hyperlink w:history="1" r:id="rIdafkzmh4ijfx_lo7yghe8n">
         <w:r>
           <w:rPr>
             <w:i/>
@@ -1971,7 +1971,7 @@
         </w:rPr>
         <w:t xml:space="preserve">A Standard Chartered card should be reported if it is lost or stolen, or if its PIN has been disclosed to a third person. The report can be made by logging in to </w:t>
       </w:r>
-      <w:hyperlink w:history="1" r:id="rId_onynbqecndsk3rpf_hes">
+      <w:hyperlink w:history="1" r:id="rId3derq69pqp6ynrls4fm9f">
         <w:r>
           <w:rPr>
             <w:color w:val="0061C7"/>
@@ -1992,7 +1992,7 @@
         </w:rPr>
         <w:t xml:space="preserve"> or </w:t>
       </w:r>
-      <w:hyperlink w:history="1" r:id="rIdi3drxjbnidv7ylclbwiug">
+      <w:hyperlink w:history="1" r:id="rIdyqev1hcgmrmfumsz66gx-">
         <w:r>
           <w:rPr>
             <w:color w:val="0061C7"/>
@@ -2063,7 +2063,7 @@
         </w:rPr>
         <w:t xml:space="preserve">A lost or stolen Standard Chartered card is reported through </w:t>
       </w:r>
-      <w:hyperlink w:history="1" r:id="rIdvnjepz3nw1aod6pttvyyi">
+      <w:hyperlink w:history="1" r:id="rId4byjtp8j_qluwiacvqsfz">
         <w:r>
           <w:rPr>
             <w:color w:val="0061C7"/>
@@ -2084,7 +2084,7 @@
         </w:rPr>
         <w:t xml:space="preserve"> or </w:t>
       </w:r>
-      <w:hyperlink w:history="1" r:id="rIda9lhbbms9wpgbzzjjw1xt">
+      <w:hyperlink w:history="1" r:id="rIdqtwjwosvrigjnekkirmwo">
         <w:r>
           <w:rPr>
             <w:color w:val="0061C7"/>
@@ -2305,7 +2305,7 @@
         </w:rPr>
         <w:t xml:space="preserve">A Standard Chartered credit or debit/ATM card PIN is reset through </w:t>
       </w:r>
-      <w:hyperlink w:history="1" r:id="rIdvpeo3i6knxvi2ripqoicn">
+      <w:hyperlink w:history="1" r:id="rId06oa_ykssksmwzurct-rg">
         <w:r>
           <w:rPr>
             <w:color w:val="0061C7"/>
@@ -2326,7 +2326,7 @@
         </w:rPr>
         <w:t xml:space="preserve"> or </w:t>
       </w:r>
-      <w:hyperlink w:history="1" r:id="rIdoy_-gbzleaayiiygfwdvv">
+      <w:hyperlink w:history="1" r:id="rIdv9lk9hfweex1dqy-dnd-q">
         <w:r>
           <w:rPr>
             <w:color w:val="0061C7"/>
@@ -2560,7 +2560,7 @@
         </w:rPr>
         <w:t xml:space="preserve">Source: </w:t>
       </w:r>
-      <w:hyperlink w:history="1" r:id="rIdrefnsdq_rxjsgxxuk8jgn">
+      <w:hyperlink w:history="1" r:id="rIdhxcey-x4y7lpzuqpyxof2">
         <w:r>
           <w:rPr>
             <w:i/>
@@ -3088,7 +3088,7 @@
         </w:rPr>
         <w:t xml:space="preserve">Source: </w:t>
       </w:r>
-      <w:hyperlink w:history="1" r:id="rIdymr3mc87j0gi6w_ildesp">
+      <w:hyperlink w:history="1" r:id="rIdtjmwr03y8ep0n4odfkvlw">
         <w:r>
           <w:rPr>
             <w:i/>

</xml_diff>